<commit_message>
feat(artigo): atualiza o artigo com o ensaio real de três assistentes de IA
- adiciona a geração do Claude (claude.ai, Opus 5.5) e retira o DeepSeek
- extrair_codigo.py passa a dividir módulos únicos pelos marcadores # T<N>
- executar_bandit.py não sobrescreve mais a classificação manual existente
- Bandit em 15 trechos: 5/15 sinalizados, 11 alertas, nenhum confirmado
  como vulnerabilidade; 4 fragilidades encontradas só na revisão manual
- reescreve resumo, métodos, Tabela 2, resultados e conclusão com os dados
  reais e remove o ensaio anterior, que não havia sido executado
- declara a busca como revisão narrativa sem registros quantitativos
- cita Pearce et al. na versão IEEE S&P 2022 e adiciona o OWASP Password
  Storage Cheat Sheet; nenhum campo pendente no DOCX
- atualiza matriz, pendências, auditoria, relatórios, checklist e README

Co-Authored-By: Claude Opus 5.5 <noreply@anthropic.com>
</commit_message>
<xml_diff>
--- a/artigo/artigo_edepa_2026_revisado.docx
+++ b/artigo/artigo_edepa_2026_revisado.docx
@@ -224,7 +224,7 @@
           <w:szCs w:val="24"/>
           <w:lang w:val="pt-BR"/>
         </w:rPr>
-        <w:t xml:space="preserve"> - Este trabalho combina revisão narrativa da literatura (2019–2026), um ensaio exploratório e um modelo ilustrativo de Programação Linear para discutir a verificação de código gerado por Inteligência Artificial Generativa (IAG) em DevSecOps, com contexto de aplicação proposto na camada de software de supervisão de uma unidade agroindustrial. O corpus reuniu onze documentos: dez estudos científicos, dos quais quatro são preprints, e um documento técnico institucional. No ensaio, cinco trechos em Python gerados por um assistente de IA, sem instruções de segurança, foram analisados com a ferramenta Bandit 1.9.4: quatro dos cinco trechos (80%) receberam ao menos um alerta automático, e uma falha de Path Traversal foi identificada apenas por revisão manual. Esses números descrevem o conjunto testado; não constituem taxa de vulnerabilidades confirmadas nem são comparáveis diretamente a outros estudos. Formulou-se ainda um modelo de Programação Linear, resolvido pelo Método Simplex e verificado computacionalmente, para alocar horas semanais da equipe entre análise estática e revisão humana. Com coeficientes hipotéticos, obteve-se x₁ = 20 h, x₂ = 20 h e Z = 200 pontos; as restrições de equipe e de revisão são ativas, e o pipeline tem folga de 4 h. O modelo é ilustrativo e depende de calibração empírica.</w:t>
+        <w:t xml:space="preserve"> - Este trabalho combina revisão narrativa da literatura (2019–2026), um ensaio exploratório e um modelo ilustrativo de Programação Linear para discutir a verificação de código gerado por Inteligência Artificial Generativa (IAG) em DevSecOps, com contexto de aplicação proposto na camada de software de supervisão de uma unidade agroindustrial. O corpus reuniu onze documentos. No ensaio, cinco tarefas sem instruções de segurança foram submetidas a três assistentes (ChatGPT, Gemini e Claude), e os 15 trechos em Python gerados foram analisados com o Bandit 1.9.4 e por revisão manual. Cinco trechos (5/15) receberam alertas, todos de severidade baixa ou média; nenhum alerta foi confirmado como vulnerabilidade, e a revisão manual identificou quatro fragilidades não sinalizadas pelo scanner. Esses resultados descrevem o conjunto testado, em condições de geração distintas, e não estimam taxas de vulnerabilidade. Formulou-se um modelo de Programação Linear, resolvido pelo Método Simplex e verificado computacionalmente, para alocar horas semanais da equipe entre análise estática e revisão humana. Com coeficientes hipotéticos, obteve-se x₁ = 20 h, x₂ = 20 h e Z = 200 pontos; as restrições de equipe e de revisão são ativas, e o pipeline tem folga de 4 h. O modelo é ilustrativo e depende de calibração empírica.</w:t>
       </w:r>
     </w:p>
     <w:p>
@@ -401,7 +401,7 @@
           <w:szCs w:val="24"/>
           <w:lang w:val="pt-BR"/>
         </w:rPr>
-        <w:t xml:space="preserve"> (SCADA), Controladores Lógicos Programáveis (CLPs) e dispositivos de Internet das Coisas (IoT) — sustentam o monitoramento de silos, secadores e linhas de processamento, e parte do software associado pode vir a ser escrita ou revisada com apoio de IAG. Pinheiro (2019) aponta que a convergência entre redes corporativas (TI) e industriais (TO) amplia a superfície de ataque de plantas automatizadas, e Zhang et al. (2024) analisam a (Gen)IA como instrumento de ataque e de defesa em sistemas de controle industrial. Contudo, a literatura também mostra que o código produzido por assistentes de IA nem sempre é seguro (Pearce et al., 2021; Perry et al., 2023) e que os próprios modelos trazem riscos de cadeia de suprimentos, como o envenenamento de dados de treinamento e </w:t>
+        <w:t xml:space="preserve"> (SCADA), Controladores Lógicos Programáveis (CLPs) e dispositivos de Internet das Coisas (IoT) — sustentam o monitoramento de silos, secadores e linhas de processamento, e parte do software associado pode vir a ser escrita ou revisada com apoio de IAG. Pinheiro (2019) aponta que a convergência entre redes corporativas (TI) e industriais (TO) amplia a superfície de ataque de plantas automatizadas, e Zhang et al. (2024) analisam a (Gen)IA como instrumento de ataque e de defesa em sistemas de controle industrial. Contudo, a literatura também mostra que o código produzido por assistentes de IA nem sempre é seguro (Pearce et al., 2022; Perry et al., 2023) e que os próprios modelos trazem riscos de cadeia de suprimentos, como o envenenamento de dados de treinamento e </w:t>
       </w:r>
       <w:r>
         <w:rPr>
@@ -481,7 +481,7 @@
           <w:szCs w:val="24"/>
           <w:lang w:val="pt-BR"/>
         </w:rPr>
-        <w:t xml:space="preserve">O objetivo geral é examinar como verificações automatizadas e humanas podem ser combinadas na verificação de código gerado por IAG no contexto delimitado, por meio de três entregas distintas: (i) uma revisão narrativa da literatura publicada entre 2019 e 2026; (ii) um ensaio exploratório com cinco trechos de código gerados por IA e analisados com a ferramenta Bandit; e (iii) um modelo ilustrativo de Programação Linear (PL), resolvido pelo Método Simplex, para a alocação de horas de verificação. Os objetivos específicos são: a) sintetizar evidências sobre a segurança de código gerado por IA, o uso de LLMs na detecção e triagem de vulnerabilidades e os riscos da cadeia de suprimentos de modelos, descrevendo o desenho e a métrica de cada estudo; b) descrever o ensaio, separando alertas automáticos, achados manuais, confirmações e mitigações propostas; c) formular, resolver e verificar computacionalmente o modelo de PL, com análise de sensibilidade das capacidades; e d) discutir implicações e limites para o contexto delimitado. O ensaio não se destina a estimar taxas de vulnerabilidade, e o modelo não é calibrado empiricamente; ambos têm caráter demonstrativo.</w:t>
+        <w:t xml:space="preserve">O objetivo geral é examinar como verificações automatizadas e humanas podem ser combinadas na verificação de código gerado por IAG no contexto delimitado, por meio de três entregas distintas: (i) uma revisão narrativa da literatura publicada entre 2019 e 2026; (ii) um ensaio exploratório com 15 trechos de código gerados por três assistentes de IA e analisados com a ferramenta Bandit; e (iii) um modelo ilustrativo de Programação Linear (PL), resolvido pelo Método Simplex, para a alocação de horas de verificação. Os objetivos específicos são: a) sintetizar evidências sobre a segurança de código gerado por IA, o uso de LLMs na detecção e triagem de vulnerabilidades e os riscos da cadeia de suprimentos de modelos, descrevendo o desenho e a métrica de cada estudo; b) descrever o ensaio, separando alertas automáticos, achados manuais, confirmações e mitigações propostas; c) formular, resolver e verificar computacionalmente o modelo de PL, com análise de sensibilidade das capacidades; e d) discutir implicações e limites para o contexto delimitado. O ensaio não se destina a estimar taxas de vulnerabilidade, e o modelo não é calibrado empiricamente; ambos têm caráter demonstrativo.</w:t>
       </w:r>
     </w:p>
     <w:p>
@@ -600,36 +600,7 @@
           <w:szCs w:val="24"/>
           <w:lang w:val="pt-BR"/>
         </w:rPr>
-        <w:t xml:space="preserve">A busca foi realizada nas bases IEEE Xplore, ACM Digital Library e arXiv e no portal do OWASP GenAI Security Project, complementada por literatura técnica sobre segurança cibernética industrial, </w:t>
-      </w:r>
-      <w:r>
-        <w:rPr>
-          <w:rFonts w:ascii="Times New Roman" w:eastAsia="Times New Roman" w:hAnsi="Times New Roman" w:cs="Times New Roman"/>
-          <w:highlight w:val="yellow"/>
-          <w:sz w:val="24"/>
-          <w:szCs w:val="24"/>
-          <w:lang w:val="pt-BR"/>
-        </w:rPr>
-        <w:t xml:space="preserve">em [datas das buscas — a informar]</w:t>
-      </w:r>
-      <w:r>
-        <w:rPr>
-          <w:rFonts w:ascii="Times New Roman" w:eastAsia="Times New Roman" w:hAnsi="Times New Roman" w:cs="Times New Roman"/>
-          <w:sz w:val="24"/>
-          <w:szCs w:val="24"/>
-          <w:lang w:val="pt-BR"/>
-        </w:rPr>
-        <w:t xml:space="preserve">. Foram usados descritores em português e inglês — “IA Generativa”/“generative AI”, “DevSecOps”, “geração de código seguro”/“secure code generation”, “detecção de vulnerabilidades”/“vulnerability detection”, “cadeia de suprimentos de IA”/“AI supply chain”, “envenenamento de dados”/“data poisoning” e “sistemas de controle industrial”/“industrial control systems” —, combinados pelos operadores booleanos AND e OR. </w:t>
-      </w:r>
-      <w:r>
-        <w:rPr>
-          <w:rFonts w:ascii="Times New Roman" w:eastAsia="Times New Roman" w:hAnsi="Times New Roman" w:cs="Times New Roman"/>
-          <w:highlight w:val="yellow"/>
-          <w:sz w:val="24"/>
-          <w:szCs w:val="24"/>
-          <w:lang w:val="pt-BR"/>
-        </w:rPr>
-        <w:t xml:space="preserve">[Expressões exatas por base e número de registros recuperados, triados e incluídos — a informar.]</w:t>
+        <w:t xml:space="preserve">A busca foi realizada nas bases IEEE Xplore, ACM Digital Library e arXiv e no portal do OWASP GenAI Security Project, complementada por literatura técnica sobre segurança cibernética industrial. Foram usados descritores em português e inglês — “IA Generativa”/“generative AI”, “DevSecOps”, “geração de código seguro”/“secure code generation”, “detecção de vulnerabilidades”/“vulnerability detection”, “cadeia de suprimentos de IA”/“AI supply chain”, “envenenamento de dados”/“data poisoning” e “sistemas de controle industrial”/“industrial control systems” —, combinados pelos operadores booleanos AND e OR. As datas, as expressões exatas por base e os quantitativos de cada etapa da seleção não foram registrados, o que limita a reprodutibilidade da busca; por isso, a revisão é caracterizada como narrativa.</w:t>
       </w:r>
     </w:p>
     <w:p>
@@ -744,7 +715,7 @@
           <w:szCs w:val="24"/>
           <w:lang w:val="pt-BR"/>
         </w:rPr>
-        <w:t xml:space="preserve"> em linguagem natural, um para cada componente delimitado — autenticação de usuário, armazenamento de senha, </w:t>
+        <w:t xml:space="preserve"> em linguagem natural, um para cada componente delimitado — autenticação de operador (T1), armazenamento de senha (T2), </w:t>
       </w:r>
       <w:r>
         <w:rPr>
@@ -763,7 +734,7 @@
           <w:szCs w:val="24"/>
           <w:lang w:val="pt-BR"/>
         </w:rPr>
-        <w:t xml:space="preserve"> de arquivo, teste de conectividade via linha de comando (</w:t>
+        <w:t xml:space="preserve"> de arquivo (T3), teste de conectividade via </w:t>
       </w:r>
       <w:r>
         <w:rPr>
@@ -782,140 +753,7 @@
           <w:szCs w:val="24"/>
           <w:lang w:val="pt-BR"/>
         </w:rPr>
-        <w:t xml:space="preserve">) e leitura de configuração em XML —, sem instruções explícitas de segurança, de modo a aproximar o uso cotidiano descrito por Perry et al. (2023). O código foi gerado em Python pelo assistente </w:t>
-      </w:r>
-      <w:r>
-        <w:rPr>
-          <w:rFonts w:ascii="Times New Roman" w:eastAsia="Times New Roman" w:hAnsi="Times New Roman" w:cs="Times New Roman"/>
-          <w:highlight w:val="yellow"/>
-          <w:sz w:val="24"/>
-          <w:szCs w:val="24"/>
-          <w:lang w:val="pt-BR"/>
-        </w:rPr>
-        <w:t xml:space="preserve">[nome e versão do modelo — a informar]</w:t>
-      </w:r>
-      <w:r>
-        <w:rPr>
-          <w:rFonts w:ascii="Times New Roman" w:eastAsia="Times New Roman" w:hAnsi="Times New Roman" w:cs="Times New Roman"/>
-          <w:sz w:val="24"/>
-          <w:szCs w:val="24"/>
-          <w:lang w:val="pt-BR"/>
-        </w:rPr>
-        <w:t xml:space="preserve">, em </w:t>
-      </w:r>
-      <w:r>
-        <w:rPr>
-          <w:rFonts w:ascii="Times New Roman" w:eastAsia="Times New Roman" w:hAnsi="Times New Roman" w:cs="Times New Roman"/>
-          <w:highlight w:val="yellow"/>
-          <w:sz w:val="24"/>
-          <w:szCs w:val="24"/>
-          <w:lang w:val="pt-BR"/>
-        </w:rPr>
-        <w:t xml:space="preserve">[data — a informar]</w:t>
-      </w:r>
-      <w:r>
-        <w:rPr>
-          <w:rFonts w:ascii="Times New Roman" w:eastAsia="Times New Roman" w:hAnsi="Times New Roman" w:cs="Times New Roman"/>
-          <w:sz w:val="24"/>
-          <w:szCs w:val="24"/>
-          <w:lang w:val="pt-BR"/>
-        </w:rPr>
-        <w:t xml:space="preserve">, </w:t>
-      </w:r>
-      <w:r>
-        <w:rPr>
-          <w:rFonts w:ascii="Times New Roman" w:eastAsia="Times New Roman" w:hAnsi="Times New Roman" w:cs="Times New Roman"/>
-          <w:highlight w:val="yellow"/>
-          <w:sz w:val="24"/>
-          <w:szCs w:val="24"/>
-          <w:lang w:val="pt-BR"/>
-        </w:rPr>
-        <w:t xml:space="preserve">[parâmetros de geração e número de gerações por prompt — a informar]</w:t>
-      </w:r>
-      <w:r>
-        <w:rPr>
-          <w:rFonts w:ascii="Times New Roman" w:eastAsia="Times New Roman" w:hAnsi="Times New Roman" w:cs="Times New Roman"/>
-          <w:sz w:val="24"/>
-          <w:szCs w:val="24"/>
-          <w:lang w:val="pt-BR"/>
-        </w:rPr>
-        <w:t xml:space="preserve">. Os trechos foram analisados com a ferramenta de análise estática de segurança (SAST) Bandit, versão 1.9.4, em Python </w:t>
-      </w:r>
-      <w:r>
-        <w:rPr>
-          <w:rFonts w:ascii="Times New Roman" w:eastAsia="Times New Roman" w:hAnsi="Times New Roman" w:cs="Times New Roman"/>
-          <w:highlight w:val="yellow"/>
-          <w:sz w:val="24"/>
-          <w:szCs w:val="24"/>
-          <w:lang w:val="pt-BR"/>
-        </w:rPr>
-        <w:t xml:space="preserve">[versão — a informar]</w:t>
-      </w:r>
-      <w:r>
-        <w:rPr>
-          <w:rFonts w:ascii="Times New Roman" w:eastAsia="Times New Roman" w:hAnsi="Times New Roman" w:cs="Times New Roman"/>
-          <w:sz w:val="24"/>
-          <w:szCs w:val="24"/>
-          <w:lang w:val="pt-BR"/>
-        </w:rPr>
-        <w:t xml:space="preserve">, </w:t>
-      </w:r>
-      <w:r>
-        <w:rPr>
-          <w:rFonts w:ascii="Times New Roman" w:eastAsia="Times New Roman" w:hAnsi="Times New Roman" w:cs="Times New Roman"/>
-          <w:highlight w:val="yellow"/>
-          <w:sz w:val="24"/>
-          <w:szCs w:val="24"/>
-          <w:lang w:val="pt-BR"/>
-        </w:rPr>
-        <w:t xml:space="preserve">[comando e configuração utilizados — a informar]</w:t>
-      </w:r>
-      <w:r>
-        <w:rPr>
-          <w:rFonts w:ascii="Times New Roman" w:eastAsia="Times New Roman" w:hAnsi="Times New Roman" w:cs="Times New Roman"/>
-          <w:sz w:val="24"/>
-          <w:szCs w:val="24"/>
-          <w:lang w:val="pt-BR"/>
-        </w:rPr>
-        <w:t xml:space="preserve">, e inspecionados manualmente pelos autores. Os </w:t>
-      </w:r>
-      <w:r>
-        <w:rPr>
-          <w:rFonts w:ascii="Times New Roman" w:eastAsia="Times New Roman" w:hAnsi="Times New Roman" w:cs="Times New Roman"/>
-          <w:i/>
-          <w:sz w:val="24"/>
-          <w:szCs w:val="24"/>
-          <w:lang w:val="pt-BR"/>
-        </w:rPr>
-        <w:t xml:space="preserve">prompts</w:t>
-      </w:r>
-      <w:r>
-        <w:rPr>
-          <w:rFonts w:ascii="Times New Roman" w:eastAsia="Times New Roman" w:hAnsi="Times New Roman" w:cs="Times New Roman"/>
-          <w:sz w:val="24"/>
-          <w:szCs w:val="24"/>
-          <w:lang w:val="pt-BR"/>
-        </w:rPr>
-        <w:t xml:space="preserve">, os códigos e os relatórios originais </w:t>
-      </w:r>
-      <w:r>
-        <w:rPr>
-          <w:rFonts w:ascii="Times New Roman" w:eastAsia="Times New Roman" w:hAnsi="Times New Roman" w:cs="Times New Roman"/>
-          <w:highlight w:val="yellow"/>
-          <w:sz w:val="24"/>
-          <w:szCs w:val="24"/>
-          <w:lang w:val="pt-BR"/>
-        </w:rPr>
-        <w:t xml:space="preserve">[serão disponibilizados]</w:t>
-      </w:r>
-      <w:r>
-        <w:rPr>
-          <w:rFonts w:ascii="Times New Roman" w:eastAsia="Times New Roman" w:hAnsi="Times New Roman" w:cs="Times New Roman"/>
-          <w:sz w:val="24"/>
-          <w:szCs w:val="24"/>
-          <w:lang w:val="pt-BR"/>
-        </w:rPr>
-        <w:t xml:space="preserve"> no repositório do trabalho (https://github.com/germanoafb/edepa-devsecops-simplex), que também contém um procedimento de reexecução do Bandit que preserva o relatório bruto em JSON.</w:t>
+        <w:t xml:space="preserve"> (T4) e leitura de configuração em XML (T5) —, sem instruções explícitas de segurança, de modo a aproximar o uso cotidiano descrito por Perry et al. (2023). Em 29 e 30/10/2026, os prompts foram submetidos, pela interface web, a três assistentes: ChatGPT (plano gratuito, modelo padrão, cujo nome não é exibido na interface, com o modo de raciocínio desligado), Gemini (plano gratuito, seletor “Gemini Auto”, com nível de raciocínio alto) e Claude (plano Pro, Claude Opus 5.5, esforço médio, com a ferramenta de execução de código ativa). Em cada assistente, as cinco tarefas foram enviadas juntas, em uma única mensagem e em conversa nova, e considerou-se a primeira resposta, sem regeneração.</w:t>
       </w:r>
     </w:p>
     <w:p>
@@ -936,40 +774,26 @@
           <w:szCs w:val="24"/>
           <w:lang w:val="pt-BR"/>
         </w:rPr>
-        <w:t xml:space="preserve">Para conferir o mapeamento entre teste, severidade, confiança e CWE do Bandit 1.9.4, a ferramenta foi executada também sobre trechos sintéticos de controle, escritos para esse fim e disponíveis no repositório; esses trechos não substituem os códigos do ensaio. Na análise, distinguiram-se: (i) alerta automático, isto é, o registro emitido pelo Bandit, com teste, severidade e confiança próprios; (ii) vulnerabilidade confirmada, cuja presença e possibilidade de exploração foram verificadas por análise humana documentada; (iii) falso positivo, quando o alerta é refutado por análise humana documentada; (iv) risco não confirmado, ainda não verificado; e (v) mitigação proposta, que não constitui detecção. As proporções são apresentadas com denominador explícito.</w:t>
-      </w:r>
-    </w:p>
-    <w:p>
-      <w:pPr>
-        <w:spacing w:before="0" w:after="0" w:line="240" w:lineRule="auto"/>
-        <w:jc w:val="both"/>
-        <w:rPr>
-          <w:rFonts w:ascii="Times New Roman" w:eastAsia="Times New Roman" w:hAnsi="Times New Roman" w:cs="Times New Roman"/>
-          <w:sz w:val="24"/>
-          <w:szCs w:val="24"/>
-        </w:rPr>
-      </w:pPr>
-    </w:p>
-    <w:p>
-      <w:pPr>
-        <w:keepNext/>
-        <w:spacing w:before="0" w:after="0" w:line="240" w:lineRule="auto"/>
-        <w:jc w:val="left"/>
-        <w:rPr>
-          <w:rFonts w:ascii="Times New Roman" w:eastAsia="Times New Roman" w:hAnsi="Times New Roman" w:cs="Times New Roman"/>
-          <w:sz w:val="24"/>
-          <w:szCs w:val="24"/>
-        </w:rPr>
-      </w:pPr>
-      <w:r>
-        <w:rPr>
-          <w:rFonts w:ascii="Times New Roman" w:eastAsia="Times New Roman" w:hAnsi="Times New Roman" w:cs="Times New Roman"/>
-          <w:b/>
-          <w:sz w:val="24"/>
-          <w:szCs w:val="24"/>
-          <w:lang w:val="pt-BR"/>
-        </w:rPr>
-        <w:t xml:space="preserve">Modelo de Programação Linear</w:t>
+        <w:t xml:space="preserve">As respostas foram preservadas sem edição. Os blocos de código Python foram extraídos por script e atribuídos a cada tarefa pelos títulos da resposta; no caso do Claude, que entregou um módulo único, pelos marcadores de seção do próprio código, com o código compartilhado mantido em arquivo à parte e atribuído à tarefa que o utiliza. Os 15 trechos foram analisados com a ferramenta de análise estática de segurança (SAST) Bandit 1.9.4, em Python 3.14.4, com a configuração padrão (python3 -m bandit -r &lt;diretório&gt; -f json). Cada alerta e cada trecho foram então revisados manualmente; a revisão foi preparada com apoio de um assistente de IA (Claude Opus 5.5) e conferida pelo primeiro autor. </w:t>
+      </w:r>
+      <w:r>
+        <w:rPr>
+          <w:rFonts w:ascii="Times New Roman" w:eastAsia="Times New Roman" w:hAnsi="Times New Roman" w:cs="Times New Roman"/>
+          <w:i/>
+          <w:sz w:val="24"/>
+          <w:szCs w:val="24"/>
+          <w:lang w:val="pt-BR"/>
+        </w:rPr>
+        <w:t xml:space="preserve">Prompts</w:t>
+      </w:r>
+      <w:r>
+        <w:rPr>
+          <w:rFonts w:ascii="Times New Roman" w:eastAsia="Times New Roman" w:hAnsi="Times New Roman" w:cs="Times New Roman"/>
+          <w:sz w:val="24"/>
+          <w:szCs w:val="24"/>
+          <w:lang w:val="pt-BR"/>
+        </w:rPr>
+        <w:t xml:space="preserve">, respostas, capturas de tela, códigos, relatórios e classificações estão no repositório do trabalho (https://github.com/germanoafb/edepa-devsecops-simplex).</w:t>
       </w:r>
     </w:p>
     <w:p>
@@ -990,7 +814,40 @@
           <w:szCs w:val="24"/>
           <w:lang w:val="pt-BR"/>
         </w:rPr>
-        <w:t xml:space="preserve">Considera-se uma equipe de DevSecOps que verifica o código gerado por IA destinado ao sistema delimitado. As variáveis de decisão são x₁, horas semanais da equipe dedicadas às atividades de análise estática automatizada (configuração, execução no pipeline e triagem dos alertas), e x₂, horas semanais da equipe dedicadas à revisão humana do código. Ambas são medidas em horas de trabalho da equipe (h/semana), o que torna homogênea a soma na restrição de capacidade total. A restrição do pipeline expressa, na mesma unidade, o limite de atividades de SAST suportado pela infraestrutura de CI/CD, admitindo-se que cada hora de execução no pipeline corresponda a uma hora de acompanhamento e triagem pela equipe. Se x₁ representasse tempo de máquina, a Equação 2 deveria ser reescrita como αx₁ + x₂ ≤ 40, em que α é a fração de hora humana por hora de execução; o modelo adotado corresponde a α = 1.</w:t>
+        <w:t xml:space="preserve">Na análise, distinguiram-se: (i) alerta automático, isto é, o registro emitido pelo Bandit, com teste, severidade e confiança próprios; (ii) vulnerabilidade confirmada, cuja presença e possibilidade de exploração foram verificadas; (iii) falso positivo, quando a revisão humana refuta o alerta; (iv) risco não confirmado, quando a fraqueza é plausível, mas a exploração não foi verificada; (v) fragilidade identificada apenas por inspeção, não sinalizada pelo scanner; e (vi) mitigação proposta, que não constitui detecção. As proporções são apresentadas com denominador explícito.</w:t>
+      </w:r>
+    </w:p>
+    <w:p>
+      <w:pPr>
+        <w:spacing w:before="0" w:after="0" w:line="240" w:lineRule="auto"/>
+        <w:jc w:val="both"/>
+        <w:rPr>
+          <w:rFonts w:ascii="Times New Roman" w:eastAsia="Times New Roman" w:hAnsi="Times New Roman" w:cs="Times New Roman"/>
+          <w:sz w:val="24"/>
+          <w:szCs w:val="24"/>
+        </w:rPr>
+      </w:pPr>
+    </w:p>
+    <w:p>
+      <w:pPr>
+        <w:keepNext/>
+        <w:spacing w:before="0" w:after="0" w:line="240" w:lineRule="auto"/>
+        <w:jc w:val="left"/>
+        <w:rPr>
+          <w:rFonts w:ascii="Times New Roman" w:eastAsia="Times New Roman" w:hAnsi="Times New Roman" w:cs="Times New Roman"/>
+          <w:sz w:val="24"/>
+          <w:szCs w:val="24"/>
+        </w:rPr>
+      </w:pPr>
+      <w:r>
+        <w:rPr>
+          <w:rFonts w:ascii="Times New Roman" w:eastAsia="Times New Roman" w:hAnsi="Times New Roman" w:cs="Times New Roman"/>
+          <w:b/>
+          <w:sz w:val="24"/>
+          <w:szCs w:val="24"/>
+          <w:lang w:val="pt-BR"/>
+        </w:rPr>
+        <w:t xml:space="preserve">Modelo de Programação Linear</w:t>
       </w:r>
     </w:p>
     <w:p>
@@ -1011,26 +868,28 @@
           <w:szCs w:val="24"/>
           <w:lang w:val="pt-BR"/>
         </w:rPr>
-        <w:t xml:space="preserve">A função objetivo Z é um índice hipotético de redução de risco, em pontos por semana. Os coeficientes 4 e 6 pontos/h e as capacidades de 40, 24 e 20 h/semana são hipóteses de um cenário ilustrativo: não foram calibrados com registros de tempo nem com uma escala de risco validada e não derivam quantitativamente dos cinco trechos do ensaio. A diferença entre os coeficientes traduz apenas a hipótese qualitativa de que a revisão humana alcança classes de falhas não cobertas pela análise estática, como ilustra o caso de </w:t>
-      </w:r>
-      <w:r>
-        <w:rPr>
-          <w:rFonts w:ascii="Times New Roman" w:eastAsia="Times New Roman" w:hAnsi="Times New Roman" w:cs="Times New Roman"/>
-          <w:i/>
-          <w:sz w:val="24"/>
-          <w:szCs w:val="24"/>
-          <w:lang w:val="pt-BR"/>
-        </w:rPr>
-        <w:t xml:space="preserve">Path Traversal</w:t>
-      </w:r>
-      <w:r>
-        <w:rPr>
-          <w:rFonts w:ascii="Times New Roman" w:eastAsia="Times New Roman" w:hAnsi="Times New Roman" w:cs="Times New Roman"/>
-          <w:sz w:val="24"/>
-          <w:szCs w:val="24"/>
-          <w:lang w:val="pt-BR"/>
-        </w:rPr>
-        <w:t xml:space="preserve">. Admite-se que cada ponto represente risco tratado (detectado e corrigido), e não apenas detectado, e que as duas atividades atuem sobre conjuntos disjuntos de falhas, sem dupla contagem. O modelo pressupõe linearidade, taxas marginais constantes, divisibilidade das horas e independência entre as atividades. Sua formulação é dada pelas Equações 1 a 5.</w:t>
+        <w:t xml:space="preserve">Considera-se uma equipe de DevSecOps que verifica o código gerado por IA destinado ao sistema delimitado. As variáveis de decisão são x₁, horas semanais da equipe dedicadas às atividades de análise estática automatizada (configuração, execução no pipeline e triagem dos alertas), e x₂, horas semanais da equipe dedicadas à revisão humana do código. Ambas são medidas em horas de trabalho da equipe (h/semana), o que torna homogênea a soma na restrição de capacidade total. A restrição do pipeline expressa, na mesma unidade, o limite de atividades de SAST suportado pela infraestrutura de CI/CD, admitindo-se que cada hora de execução no pipeline corresponda a uma hora de acompanhamento e triagem pela equipe. Se x₁ representasse tempo de máquina, a Equação 2 deveria ser reescrita como αx₁ + x₂ ≤ 40, em que α é a fração de hora humana por hora de execução; o modelo adotado corresponde a α = 1.</w:t>
+      </w:r>
+    </w:p>
+    <w:p>
+      <w:pPr>
+        <w:spacing w:before="0" w:after="0" w:line="240" w:lineRule="auto"/>
+        <w:ind w:firstLine="567"/>
+        <w:jc w:val="both"/>
+        <w:rPr>
+          <w:rFonts w:ascii="Times New Roman" w:eastAsia="Times New Roman" w:hAnsi="Times New Roman" w:cs="Times New Roman"/>
+          <w:sz w:val="24"/>
+          <w:szCs w:val="24"/>
+        </w:rPr>
+      </w:pPr>
+      <w:r>
+        <w:rPr>
+          <w:rFonts w:ascii="Times New Roman" w:eastAsia="Times New Roman" w:hAnsi="Times New Roman" w:cs="Times New Roman"/>
+          <w:sz w:val="24"/>
+          <w:szCs w:val="24"/>
+          <w:lang w:val="pt-BR"/>
+        </w:rPr>
+        <w:t xml:space="preserve">A função objetivo Z é um índice hipotético de redução de risco, em pontos por semana. Os coeficientes 4 e 6 pontos/h e as capacidades de 40, 24 e 20 h/semana são hipóteses de um cenário ilustrativo: não foram calibrados com registros de tempo nem com uma escala de risco validada e não derivam quantitativamente dos 15 trechos do ensaio. A diferença entre os coeficientes traduz apenas a hipótese qualitativa de que a revisão humana alcança classes de falhas não cobertas pela análise estática, como ilustram, no ensaio, as fragilidades identificadas apenas na revisão manual. Admite-se que cada ponto represente risco tratado (detectado e corrigido), e não apenas detectado, e que as duas atividades atuem sobre conjuntos disjuntos de falhas, sem dupla contagem. O modelo pressupõe linearidade, taxas marginais constantes, divisibilidade das horas e independência entre as atividades. Sua formulação é dada pelas Equações 1 a 5.</w:t>
       </w:r>
     </w:p>
     <w:p>
@@ -1609,7 +1468,7 @@
                 <w:szCs w:val="20"/>
                 <w:lang w:val="pt-BR"/>
               </w:rPr>
-              <w:t xml:space="preserve">Pearce et al. (2021)</w:t>
+              <w:t xml:space="preserve">Pearce et al. (2022)</w:t>
             </w:r>
           </w:p>
         </w:tc>
@@ -1636,7 +1495,7 @@
                 <w:szCs w:val="20"/>
                 <w:lang w:val="pt-BR"/>
               </w:rPr>
-              <w:t xml:space="preserve">C1*</w:t>
+              <w:t xml:space="preserve">C1</w:t>
             </w:r>
           </w:p>
         </w:tc>
@@ -2843,7 +2702,7 @@
           <w:szCs w:val="20"/>
           <w:lang w:val="pt-BR"/>
         </w:rPr>
-        <w:t xml:space="preserve">Fonte: elaborado pelos autores (2026). C1: revisado por pares; C2: preprint, não revisado por pares (versão consultada nas referências); C3: documento técnico institucional; Anais: trabalho técnico em anais, revisão por pares não verificada. *Versão consultada no arXiv; publicada posteriormente no IEEE S&amp;P 2022.</w:t>
+        <w:t xml:space="preserve">Fonte: elaborado pelos autores (2026). C1: revisado por pares; C2: preprint, não revisado por pares (versão consultada nas referências); C3: documento técnico institucional; Anais: trabalho técnico em anais, revisão por pares não verificada.</w:t>
       </w:r>
     </w:p>
     <w:p>
@@ -2878,7 +2737,7 @@
           <w:szCs w:val="24"/>
           <w:lang w:val="pt-BR"/>
         </w:rPr>
-        <w:t xml:space="preserve">Os estudos sobre geração de código não medem a mesma grandeza. Pearce et al. (2021) reportam a proporção de programas vulneráveis (≈40%) entre 1.689 programas gerados em 89 cenários desenhados para induzir CWEs específicas; Perry et al. (2023) comparam a segurança das soluções de participantes com e sem assistente; e Wang et al. (2024) avaliam LLMs em um benchmark de 180 amostras. Como diferem em linguagens, modelos, tarefas, critérios de vulnerabilidade e denominadores, esses resultados não são reduzidos a uma faixa geral de prevalência. Em conjunto, indicam que código gerado por IA pode conter vulnerabilidades e que o assistente pode aumentar a confiança indevida do desenvolvedor.</w:t>
+        <w:t xml:space="preserve">Os estudos sobre geração de código não medem a mesma grandeza. Pearce et al. (2022) reportam a proporção de programas vulneráveis (≈40%) entre 1.689 programas gerados em 89 cenários desenhados para induzir CWEs específicas; Perry et al. (2023) comparam a segurança das soluções de participantes com e sem assistente; e Wang et al. (2024) avaliam LLMs em um benchmark de 180 amostras. Como diferem em linguagens, modelos, tarefas, critérios de vulnerabilidade e denominadores, esses resultados não são reduzidos a uma faixa geral de prevalência. Em conjunto, indicam que código gerado por IA pode conter vulnerabilidades e que o assistente pode aumentar a confiança indevida do desenvolvedor.</w:t>
       </w:r>
     </w:p>
     <w:p>
@@ -3161,7 +3020,7 @@
           <w:szCs w:val="24"/>
           <w:lang w:val="pt-BR"/>
         </w:rPr>
-        <w:t xml:space="preserve">A Tabela 2 resume os registros do ensaio, separando a classificação reportada pelo Bandit, o teste compatível na documentação da ferramenta e a situação após a análise humana.</w:t>
+        <w:t xml:space="preserve">A Tabela 2 apresenta, para cada tarefa e assistente, os alertas do Bandit e a situação após a revisão humana.</w:t>
       </w:r>
     </w:p>
     <w:p>
@@ -3196,7 +3055,7 @@
           <w:szCs w:val="24"/>
           <w:lang w:val="pt-BR"/>
         </w:rPr>
-        <w:t xml:space="preserve">Tabela 2: Registros do ensaio exploratório com o Bandit 1.9.4 e situação de cada achado</w:t>
+        <w:t xml:space="preserve">Tabela 2: Alertas do Bandit 1.9.4 (severidade / confiança) e situação após a revisão humana</w:t>
       </w:r>
     </w:p>
     <w:tbl>
@@ -3214,10 +3073,10 @@
         <w:tblLayout w:type="fixed"/>
       </w:tblPr>
       <w:tblGrid>
-        <w:gridCol w:w="1650"/>
-        <w:gridCol w:w="2900"/>
-        <w:gridCol w:w="2300"/>
-        <w:gridCol w:w="2750"/>
+        <w:gridCol w:w="1700"/>
+        <w:gridCol w:w="2700"/>
+        <w:gridCol w:w="2700"/>
+        <w:gridCol w:w="2500"/>
       </w:tblGrid>
       <w:tr>
         <w:trPr>
@@ -3226,7 +3085,7 @@
         </w:trPr>
         <w:tc>
           <w:tcPr>
-            <w:tcW w:w="1650" w:type="dxa"/>
+            <w:tcW w:w="1700" w:type="dxa"/>
             <w:shd w:val="clear" w:color="auto" w:fill="D9D9D9"/>
             <w:tcMar>
               <w:top w:w="30" w:type="dxa"/>
@@ -3249,13 +3108,13 @@
                 <w:szCs w:val="20"/>
                 <w:lang w:val="pt-BR"/>
               </w:rPr>
-              <w:t xml:space="preserve">Trecho (tarefa)</w:t>
-            </w:r>
-          </w:p>
-        </w:tc>
-        <w:tc>
-          <w:tcPr>
-            <w:tcW w:w="2900" w:type="dxa"/>
+              <w:t xml:space="preserve">Tarefa</w:t>
+            </w:r>
+          </w:p>
+        </w:tc>
+        <w:tc>
+          <w:tcPr>
+            <w:tcW w:w="2700" w:type="dxa"/>
             <w:shd w:val="clear" w:color="auto" w:fill="D9D9D9"/>
             <w:tcMar>
               <w:top w:w="30" w:type="dxa"/>
@@ -3278,13 +3137,13 @@
                 <w:szCs w:val="20"/>
                 <w:lang w:val="pt-BR"/>
               </w:rPr>
-              <w:t xml:space="preserve">Registro do Bandit reportado (CWE do scanner; severidade / confiança)</w:t>
-            </w:r>
-          </w:p>
-        </w:tc>
-        <w:tc>
-          <w:tcPr>
-            <w:tcW w:w="2300" w:type="dxa"/>
+              <w:t xml:space="preserve">ChatGPT</w:t>
+            </w:r>
+          </w:p>
+        </w:tc>
+        <w:tc>
+          <w:tcPr>
+            <w:tcW w:w="2700" w:type="dxa"/>
             <w:shd w:val="clear" w:color="auto" w:fill="D9D9D9"/>
             <w:tcMar>
               <w:top w:w="30" w:type="dxa"/>
@@ -3307,13 +3166,13 @@
                 <w:szCs w:val="20"/>
                 <w:lang w:val="pt-BR"/>
               </w:rPr>
-              <w:t xml:space="preserve">Teste compatível no Bandit 1.9.4 (a confirmar no relatório)</w:t>
-            </w:r>
-          </w:p>
-        </w:tc>
-        <w:tc>
-          <w:tcPr>
-            <w:tcW w:w="2750" w:type="dxa"/>
+              <w:t xml:space="preserve">Gemini</w:t>
+            </w:r>
+          </w:p>
+        </w:tc>
+        <w:tc>
+          <w:tcPr>
+            <w:tcW w:w="2500" w:type="dxa"/>
             <w:shd w:val="clear" w:color="auto" w:fill="D9D9D9"/>
             <w:tcMar>
               <w:top w:w="30" w:type="dxa"/>
@@ -3336,7 +3195,7 @@
                 <w:szCs w:val="20"/>
                 <w:lang w:val="pt-BR"/>
               </w:rPr>
-              <w:t xml:space="preserve">Situação após análise humana</w:t>
+              <w:t xml:space="preserve">Claude</w:t>
             </w:r>
           </w:p>
         </w:tc>
@@ -3347,7 +3206,7 @@
         </w:trPr>
         <w:tc>
           <w:tcPr>
-            <w:tcW w:w="1650" w:type="dxa"/>
+            <w:tcW w:w="1700" w:type="dxa"/>
             <w:tcMar>
               <w:top w:w="30" w:type="dxa"/>
               <w:left w:w="70" w:type="dxa"/>
@@ -3368,13 +3227,13 @@
                 <w:szCs w:val="20"/>
                 <w:lang w:val="pt-BR"/>
               </w:rPr>
-              <w:t xml:space="preserve">1. Autenticação de usuário</w:t>
-            </w:r>
-          </w:p>
-        </w:tc>
-        <w:tc>
-          <w:tcPr>
-            <w:tcW w:w="2900" w:type="dxa"/>
+              <w:t xml:space="preserve">T1. Autenticação</w:t>
+            </w:r>
+          </w:p>
+        </w:tc>
+        <w:tc>
+          <w:tcPr>
+            <w:tcW w:w="2700" w:type="dxa"/>
             <w:tcMar>
               <w:top w:w="30" w:type="dxa"/>
               <w:left w:w="70" w:type="dxa"/>
@@ -3395,13 +3254,13 @@
                 <w:szCs w:val="20"/>
                 <w:lang w:val="pt-BR"/>
               </w:rPr>
-              <w:t xml:space="preserve">SQL Injection por concatenação de string; CWE-89; Média / Baixa</w:t>
-            </w:r>
-          </w:p>
-        </w:tc>
-        <w:tc>
-          <w:tcPr>
-            <w:tcW w:w="2300" w:type="dxa"/>
+              <w:t xml:space="preserve">Sem alerta. Sem achado manual</w:t>
+            </w:r>
+          </w:p>
+        </w:tc>
+        <w:tc>
+          <w:tcPr>
+            <w:tcW w:w="2700" w:type="dxa"/>
             <w:tcMar>
               <w:top w:w="30" w:type="dxa"/>
               <w:left w:w="70" w:type="dxa"/>
@@ -3422,13 +3281,13 @@
                 <w:szCs w:val="20"/>
                 <w:lang w:val="pt-BR"/>
               </w:rPr>
-              <w:t xml:space="preserve">B608 (confiança Baixa quando a consulta é montada fora da chamada execute)</w:t>
-            </w:r>
-          </w:p>
-        </w:tc>
-        <w:tc>
-          <w:tcPr>
-            <w:tcW w:w="2750" w:type="dxa"/>
+              <w:t xml:space="preserve">Sem alerta. Manual: hash comparado com == (CWE-208) e PBKDF2 com 100 mil iterações (CWE-916)</w:t>
+            </w:r>
+          </w:p>
+        </w:tc>
+        <w:tc>
+          <w:tcPr>
+            <w:tcW w:w="2500" w:type="dxa"/>
             <w:tcMar>
               <w:top w:w="30" w:type="dxa"/>
               <w:left w:w="70" w:type="dxa"/>
@@ -3449,7 +3308,7 @@
                 <w:szCs w:val="20"/>
                 <w:lang w:val="pt-BR"/>
               </w:rPr>
-              <w:t xml:space="preserve">Risco plausível; exploração depende da origem da entrada; confirmação não documentada</w:t>
+              <w:t xml:space="preserve">Sem alerta. Sem achado manual</w:t>
             </w:r>
           </w:p>
         </w:tc>
@@ -3460,7 +3319,7 @@
         </w:trPr>
         <w:tc>
           <w:tcPr>
-            <w:tcW w:w="1650" w:type="dxa"/>
+            <w:tcW w:w="1700" w:type="dxa"/>
             <w:tcMar>
               <w:top w:w="30" w:type="dxa"/>
               <w:left w:w="70" w:type="dxa"/>
@@ -3481,13 +3340,13 @@
                 <w:szCs w:val="20"/>
                 <w:lang w:val="pt-BR"/>
               </w:rPr>
-              <w:t xml:space="preserve">2. Armazenamento de senha</w:t>
-            </w:r>
-          </w:p>
-        </w:tc>
-        <w:tc>
-          <w:tcPr>
-            <w:tcW w:w="2900" w:type="dxa"/>
+              <w:t xml:space="preserve">T2. Armazenamento de senha</w:t>
+            </w:r>
+          </w:p>
+        </w:tc>
+        <w:tc>
+          <w:tcPr>
+            <w:tcW w:w="2700" w:type="dxa"/>
             <w:tcMar>
               <w:top w:w="30" w:type="dxa"/>
               <w:left w:w="70" w:type="dxa"/>
@@ -3508,13 +3367,13 @@
                 <w:szCs w:val="20"/>
                 <w:lang w:val="pt-BR"/>
               </w:rPr>
-              <w:t xml:space="preserve">Hash criptograficamente fraco (MD5); CWE-327; Alta / Alta</w:t>
-            </w:r>
-          </w:p>
-        </w:tc>
-        <w:tc>
-          <w:tcPr>
-            <w:tcW w:w="2300" w:type="dxa"/>
+              <w:t xml:space="preserve">Sem alerta. Sem achado manual</w:t>
+            </w:r>
+          </w:p>
+        </w:tc>
+        <w:tc>
+          <w:tcPr>
+            <w:tcW w:w="2700" w:type="dxa"/>
             <w:tcMar>
               <w:top w:w="30" w:type="dxa"/>
               <w:left w:w="70" w:type="dxa"/>
@@ -3535,13 +3394,13 @@
                 <w:szCs w:val="20"/>
                 <w:lang w:val="pt-BR"/>
               </w:rPr>
-              <w:t xml:space="preserve">B324 (hashlib)</w:t>
-            </w:r>
-          </w:p>
-        </w:tc>
-        <w:tc>
-          <w:tcPr>
-            <w:tcW w:w="2750" w:type="dxa"/>
+              <w:t xml:space="preserve">Sem alerta. Manual: PBKDF2 com 100 mil iterações (CWE-916)</w:t>
+            </w:r>
+          </w:p>
+        </w:tc>
+        <w:tc>
+          <w:tcPr>
+            <w:tcW w:w="2500" w:type="dxa"/>
             <w:tcMar>
               <w:top w:w="30" w:type="dxa"/>
               <w:left w:w="70" w:type="dxa"/>
@@ -3562,7 +3421,7 @@
                 <w:szCs w:val="20"/>
                 <w:lang w:val="pt-BR"/>
               </w:rPr>
-              <w:t xml:space="preserve">Fraqueza verificável por inspeção; registro da confirmação pendente</w:t>
+              <w:t xml:space="preserve">Sem alerta. Sem achado manual</w:t>
             </w:r>
           </w:p>
         </w:tc>
@@ -3573,7 +3432,7 @@
         </w:trPr>
         <w:tc>
           <w:tcPr>
-            <w:tcW w:w="1650" w:type="dxa"/>
+            <w:tcW w:w="1700" w:type="dxa"/>
             <w:tcMar>
               <w:top w:w="30" w:type="dxa"/>
               <w:left w:w="70" w:type="dxa"/>
@@ -3594,13 +3453,13 @@
                 <w:szCs w:val="20"/>
                 <w:lang w:val="pt-BR"/>
               </w:rPr>
-              <w:t xml:space="preserve">3. Upload de arquivo</w:t>
-            </w:r>
-          </w:p>
-        </w:tc>
-        <w:tc>
-          <w:tcPr>
-            <w:tcW w:w="2900" w:type="dxa"/>
+              <w:t xml:space="preserve">T3. Upload de arquivo</w:t>
+            </w:r>
+          </w:p>
+        </w:tc>
+        <w:tc>
+          <w:tcPr>
+            <w:tcW w:w="2700" w:type="dxa"/>
             <w:tcMar>
               <w:top w:w="30" w:type="dxa"/>
               <w:left w:w="70" w:type="dxa"/>
@@ -3621,13 +3480,13 @@
                 <w:szCs w:val="20"/>
                 <w:lang w:val="pt-BR"/>
               </w:rPr>
-              <w:t xml:space="preserve">Nenhum alerta</w:t>
-            </w:r>
-          </w:p>
-        </w:tc>
-        <w:tc>
-          <w:tcPr>
-            <w:tcW w:w="2300" w:type="dxa"/>
+              <w:t xml:space="preserve">Sem alerta. Sem achado manual</w:t>
+            </w:r>
+          </w:p>
+        </w:tc>
+        <w:tc>
+          <w:tcPr>
+            <w:tcW w:w="2700" w:type="dxa"/>
             <w:tcMar>
               <w:top w:w="30" w:type="dxa"/>
               <w:left w:w="70" w:type="dxa"/>
@@ -3648,13 +3507,13 @@
                 <w:szCs w:val="20"/>
                 <w:lang w:val="pt-BR"/>
               </w:rPr>
-              <w:t xml:space="preserve">— (não há teste geral de path traversal em operações de arquivo)</w:t>
-            </w:r>
-          </w:p>
-        </w:tc>
-        <w:tc>
-          <w:tcPr>
-            <w:tcW w:w="2750" w:type="dxa"/>
+              <w:t xml:space="preserve">Sem alerta. Manual: sem restrição de tipo e com sobrescrita de arquivos (CWE-434)</w:t>
+            </w:r>
+          </w:p>
+        </w:tc>
+        <w:tc>
+          <w:tcPr>
+            <w:tcW w:w="2500" w:type="dxa"/>
             <w:tcMar>
               <w:top w:w="30" w:type="dxa"/>
               <w:left w:w="70" w:type="dxa"/>
@@ -3675,7 +3534,7 @@
                 <w:szCs w:val="20"/>
                 <w:lang w:val="pt-BR"/>
               </w:rPr>
-              <w:t xml:space="preserve">Achado manual: Path Traversal (CWE-22)</w:t>
+              <w:t xml:space="preserve">Sem alerta. Sem achado manual</w:t>
             </w:r>
           </w:p>
         </w:tc>
@@ -3686,7 +3545,7 @@
         </w:trPr>
         <w:tc>
           <w:tcPr>
-            <w:tcW w:w="1650" w:type="dxa"/>
+            <w:tcW w:w="1700" w:type="dxa"/>
             <w:tcMar>
               <w:top w:w="30" w:type="dxa"/>
               <w:left w:w="70" w:type="dxa"/>
@@ -3707,13 +3566,13 @@
                 <w:szCs w:val="20"/>
                 <w:lang w:val="pt-BR"/>
               </w:rPr>
-              <w:t xml:space="preserve">4. Teste de conectividade (ping)</w:t>
-            </w:r>
-          </w:p>
-        </w:tc>
-        <w:tc>
-          <w:tcPr>
-            <w:tcW w:w="2900" w:type="dxa"/>
+              <w:t xml:space="preserve">T4. Conectividade (ping)</w:t>
+            </w:r>
+          </w:p>
+        </w:tc>
+        <w:tc>
+          <w:tcPr>
+            <w:tcW w:w="2700" w:type="dxa"/>
             <w:tcMar>
               <w:top w:w="30" w:type="dxa"/>
               <w:left w:w="70" w:type="dxa"/>
@@ -3734,13 +3593,13 @@
                 <w:szCs w:val="20"/>
                 <w:lang w:val="pt-BR"/>
               </w:rPr>
-              <w:t xml:space="preserve">Injeção de comando via shell; CWE-78; Alta / Alta</w:t>
-            </w:r>
-          </w:p>
-        </w:tc>
-        <w:tc>
-          <w:tcPr>
-            <w:tcW w:w="2300" w:type="dxa"/>
+              <w:t xml:space="preserve">B404, B603, B607 (Baixa / Alta): falsos positivos</w:t>
+            </w:r>
+          </w:p>
+        </w:tc>
+        <w:tc>
+          <w:tcPr>
+            <w:tcW w:w="2700" w:type="dxa"/>
             <w:tcMar>
               <w:top w:w="30" w:type="dxa"/>
               <w:left w:w="70" w:type="dxa"/>
@@ -3761,13 +3620,13 @@
                 <w:szCs w:val="20"/>
                 <w:lang w:val="pt-BR"/>
               </w:rPr>
-              <w:t xml:space="preserve">B602 ou B605; pode haver também B404 (Baixa / Alta)</w:t>
-            </w:r>
-          </w:p>
-        </w:tc>
-        <w:tc>
-          <w:tcPr>
-            <w:tcW w:w="2750" w:type="dxa"/>
+              <w:t xml:space="preserve">B404 (Baixa / Alta): falso positivo. B603 (Baixa / Alta): injeção de argumento (CWE-88) não confirmada</w:t>
+            </w:r>
+          </w:p>
+        </w:tc>
+        <w:tc>
+          <w:tcPr>
+            <w:tcW w:w="2500" w:type="dxa"/>
             <w:tcMar>
               <w:top w:w="30" w:type="dxa"/>
               <w:left w:w="70" w:type="dxa"/>
@@ -3788,7 +3647,7 @@
                 <w:szCs w:val="20"/>
                 <w:lang w:val="pt-BR"/>
               </w:rPr>
-              <w:t xml:space="preserve">Exploração depende de o host vir de entrada externa; confirmação não documentada</w:t>
+              <w:t xml:space="preserve">B404, B603 (Baixa / Alta): falsos positivos</w:t>
             </w:r>
           </w:p>
         </w:tc>
@@ -3799,7 +3658,7 @@
         </w:trPr>
         <w:tc>
           <w:tcPr>
-            <w:tcW w:w="1650" w:type="dxa"/>
+            <w:tcW w:w="1700" w:type="dxa"/>
             <w:tcMar>
               <w:top w:w="30" w:type="dxa"/>
               <w:left w:w="70" w:type="dxa"/>
@@ -3820,13 +3679,13 @@
                 <w:szCs w:val="20"/>
                 <w:lang w:val="pt-BR"/>
               </w:rPr>
-              <w:t xml:space="preserve">5. Leitura de configuração XML</w:t>
-            </w:r>
-          </w:p>
-        </w:tc>
-        <w:tc>
-          <w:tcPr>
-            <w:tcW w:w="2900" w:type="dxa"/>
+              <w:t xml:space="preserve">T5. Configuração XML</w:t>
+            </w:r>
+          </w:p>
+        </w:tc>
+        <w:tc>
+          <w:tcPr>
+            <w:tcW w:w="2700" w:type="dxa"/>
             <w:tcMar>
               <w:top w:w="30" w:type="dxa"/>
               <w:left w:w="70" w:type="dxa"/>
@@ -3847,13 +3706,13 @@
                 <w:szCs w:val="20"/>
                 <w:lang w:val="pt-BR"/>
               </w:rPr>
-              <w:t xml:space="preserve">Parsing de XML não confiável; CWE-20; “Baixa-Média / Alta” (agregado)</w:t>
-            </w:r>
-          </w:p>
-        </w:tc>
-        <w:tc>
-          <w:tcPr>
-            <w:tcW w:w="2300" w:type="dxa"/>
+              <w:t xml:space="preserve">B405 (Baixa / Alta), B314 (Média / Alta): risco não confirmado</w:t>
+            </w:r>
+          </w:p>
+        </w:tc>
+        <w:tc>
+          <w:tcPr>
+            <w:tcW w:w="2700" w:type="dxa"/>
             <w:tcMar>
               <w:top w:w="30" w:type="dxa"/>
               <w:left w:w="70" w:type="dxa"/>
@@ -3874,13 +3733,13 @@
                 <w:szCs w:val="20"/>
                 <w:lang w:val="pt-BR"/>
               </w:rPr>
-              <w:t xml:space="preserve">B405 (Baixa / Alta) e B314 (Média / Alta), se usado xml.etree</w:t>
-            </w:r>
-          </w:p>
-        </w:tc>
-        <w:tc>
-          <w:tcPr>
-            <w:tcW w:w="2750" w:type="dxa"/>
+              <w:t xml:space="preserve">B405 (Baixa / Alta), B314 (Média / Alta): risco não confirmado</w:t>
+            </w:r>
+          </w:p>
+        </w:tc>
+        <w:tc>
+          <w:tcPr>
+            <w:tcW w:w="2500" w:type="dxa"/>
             <w:tcMar>
               <w:top w:w="30" w:type="dxa"/>
               <w:left w:w="70" w:type="dxa"/>
@@ -3901,7 +3760,7 @@
                 <w:szCs w:val="20"/>
                 <w:lang w:val="pt-BR"/>
               </w:rPr>
-              <w:t xml:space="preserve">XXE (CWE-611) não confirmado; risco não confirmado</w:t>
+              <w:t xml:space="preserve">Sem alerta (usa defusedxml). Sem achado manual</w:t>
             </w:r>
           </w:p>
         </w:tc>
@@ -3924,7 +3783,7 @@
           <w:szCs w:val="20"/>
           <w:lang w:val="pt-BR"/>
         </w:rPr>
-        <w:t xml:space="preserve">Fonte: elaborado pelos autores (2026). A segunda coluna reproduz os registros do ensaio; a terceira indica compatibilidade com a documentação (PyCQA, 2026) e com a execução de controle, e deve ser substituída pelos identificadores e linhas do relatório original.</w:t>
+        <w:t xml:space="preserve">Fonte: elaborado pelos autores (2026), a partir dos relatórios do Bandit e da revisão manual disponíveis no repositório. Os alertas da T4 e da T5 recebem CWE-78 e CWE-20, respectivamente, na taxonomia do scanner.</w:t>
       </w:r>
     </w:p>
     <w:p>
@@ -3959,7 +3818,64 @@
           <w:szCs w:val="24"/>
           <w:lang w:val="pt-BR"/>
         </w:rPr>
-        <w:t xml:space="preserve">Quatro dos cinco trechos (4/5 = 80%) receberam ao menos um alerta automático do Bandit. Essa proporção mede a cobertura automática do scanner sobre o conjunto testado e não equivale a 80% de vulnerabilidades confirmadas, pois a confirmação humana de cada alerta, com evidência do fluxo de entrada e da possibilidade de exploração, não está documentada para os quatro trechos. Os alertas também não são homogêneos: cada um tem severidade e confiança próprias, e a classificação “Baixa-Média / Alta” do trecho 5 agrega pelo menos dois registros, que devem ser apresentados separadamente com base no relatório original.</w:t>
+        <w:t xml:space="preserve">Cinco das 15 tarefas (5/15) receberam ao menos um alerta automático, com 11 alertas no total: nenhum de severidade alta, dois de severidade média (B314) e nove de severidade baixa. Após a revisão humana, nenhum alerta foi confirmado como vulnerabilidade: seis foram classificados como falsos positivos e cinco como riscos não confirmados. Os falsos positivos concentram-se na T4: os três assistentes executaram o </w:t>
+      </w:r>
+      <w:r>
+        <w:rPr>
+          <w:rFonts w:ascii="Times New Roman" w:eastAsia="Times New Roman" w:hAnsi="Times New Roman" w:cs="Times New Roman"/>
+          <w:i/>
+          <w:sz w:val="24"/>
+          <w:szCs w:val="24"/>
+          <w:lang w:val="pt-BR"/>
+        </w:rPr>
+        <w:t xml:space="preserve">ping</w:t>
+      </w:r>
+      <w:r>
+        <w:rPr>
+          <w:rFonts w:ascii="Times New Roman" w:eastAsia="Times New Roman" w:hAnsi="Times New Roman" w:cs="Times New Roman"/>
+          <w:sz w:val="24"/>
+          <w:szCs w:val="24"/>
+          <w:lang w:val="pt-BR"/>
+        </w:rPr>
+        <w:t xml:space="preserve"> sem </w:t>
+      </w:r>
+      <w:r>
+        <w:rPr>
+          <w:rFonts w:ascii="Times New Roman" w:eastAsia="Times New Roman" w:hAnsi="Times New Roman" w:cs="Times New Roman"/>
+          <w:i/>
+          <w:sz w:val="24"/>
+          <w:szCs w:val="24"/>
+          <w:lang w:val="pt-BR"/>
+        </w:rPr>
+        <w:t xml:space="preserve">shell</w:t>
+      </w:r>
+      <w:r>
+        <w:rPr>
+          <w:rFonts w:ascii="Times New Roman" w:eastAsia="Times New Roman" w:hAnsi="Times New Roman" w:cs="Times New Roman"/>
+          <w:sz w:val="24"/>
+          <w:szCs w:val="24"/>
+          <w:lang w:val="pt-BR"/>
+        </w:rPr>
+        <w:t xml:space="preserve">, com lista de argumentos, e o ChatGPT e o Claude validaram o endereço; os testes B404, B603 e B607 sinalizam o uso de subprocess, e não uma injeção. No Gemini, o endereço não é validado, de modo que um valor iniciado por hífen seria interpretado como opção do </w:t>
+      </w:r>
+      <w:r>
+        <w:rPr>
+          <w:rFonts w:ascii="Times New Roman" w:eastAsia="Times New Roman" w:hAnsi="Times New Roman" w:cs="Times New Roman"/>
+          <w:i/>
+          <w:sz w:val="24"/>
+          <w:szCs w:val="24"/>
+          <w:lang w:val="pt-BR"/>
+        </w:rPr>
+        <w:t xml:space="preserve">ping</w:t>
+      </w:r>
+      <w:r>
+        <w:rPr>
+          <w:rFonts w:ascii="Times New Roman" w:eastAsia="Times New Roman" w:hAnsi="Times New Roman" w:cs="Times New Roman"/>
+          <w:sz w:val="24"/>
+          <w:szCs w:val="24"/>
+          <w:lang w:val="pt-BR"/>
+        </w:rPr>
+        <w:t xml:space="preserve"> (injeção de argumento, CWE-88), sem permitir a execução de comando arbitrário; o risco foi registrado como não confirmado.</w:t>
       </w:r>
     </w:p>
     <w:p>
@@ -3980,7 +3896,7 @@
           <w:szCs w:val="24"/>
           <w:lang w:val="pt-BR"/>
         </w:rPr>
-        <w:t xml:space="preserve">Separadamente, a revisão manual identificou no trecho de </w:t>
+        <w:t xml:space="preserve">Na T5, o ChatGPT e o Gemini usaram o módulo xml.etree, sinalizado pelos testes B405 e B314 (CWE-20 na taxonomia do scanner). A classificação humana como XXE (CWE-611) não decorre do simples uso do </w:t>
       </w:r>
       <w:r>
         <w:rPr>
@@ -3990,54 +3906,16 @@
           <w:szCs w:val="24"/>
           <w:lang w:val="pt-BR"/>
         </w:rPr>
-        <w:t xml:space="preserve">upload</w:t>
-      </w:r>
-      <w:r>
-        <w:rPr>
-          <w:rFonts w:ascii="Times New Roman" w:eastAsia="Times New Roman" w:hAnsi="Times New Roman" w:cs="Times New Roman"/>
-          <w:sz w:val="24"/>
-          <w:szCs w:val="24"/>
-          <w:lang w:val="pt-BR"/>
-        </w:rPr>
-        <w:t xml:space="preserve"> uma fraqueza de </w:t>
-      </w:r>
-      <w:r>
-        <w:rPr>
-          <w:rFonts w:ascii="Times New Roman" w:eastAsia="Times New Roman" w:hAnsi="Times New Roman" w:cs="Times New Roman"/>
-          <w:i/>
-          <w:sz w:val="24"/>
-          <w:szCs w:val="24"/>
-          <w:lang w:val="pt-BR"/>
-        </w:rPr>
-        <w:t xml:space="preserve">Path Traversal</w:t>
-      </w:r>
-      <w:r>
-        <w:rPr>
-          <w:rFonts w:ascii="Times New Roman" w:eastAsia="Times New Roman" w:hAnsi="Times New Roman" w:cs="Times New Roman"/>
-          <w:sz w:val="24"/>
-          <w:szCs w:val="24"/>
-          <w:lang w:val="pt-BR"/>
-        </w:rPr>
-        <w:t xml:space="preserve"> (CWE-22): o nome do arquivo fornecido pelo usuário era concatenado ao diretório de destino sem sanitização, o que, em tese, permitiria gravar arquivos fora do diretório pretendido. Esse resultado é contabilizado em denominador próprio — um achado manual em cinco trechos — e não é somado à detecção automática. A ausência de alerta é compatível com o conjunto de testes do Bandit, que não inclui verificação geral de </w:t>
-      </w:r>
-      <w:r>
-        <w:rPr>
-          <w:rFonts w:ascii="Times New Roman" w:eastAsia="Times New Roman" w:hAnsi="Times New Roman" w:cs="Times New Roman"/>
-          <w:i/>
-          <w:sz w:val="24"/>
-          <w:szCs w:val="24"/>
-          <w:lang w:val="pt-BR"/>
-        </w:rPr>
-        <w:t xml:space="preserve">path traversal</w:t>
-      </w:r>
-      <w:r>
-        <w:rPr>
-          <w:rFonts w:ascii="Times New Roman" w:eastAsia="Times New Roman" w:hAnsi="Times New Roman" w:cs="Times New Roman"/>
-          <w:sz w:val="24"/>
-          <w:szCs w:val="24"/>
-          <w:lang w:val="pt-BR"/>
-        </w:rPr>
-        <w:t xml:space="preserve"> em operações de arquivo (PyCQA, 2026).</w:t>
+        <w:t xml:space="preserve">parser</w:t>
+      </w:r>
+      <w:r>
+        <w:rPr>
+          <w:rFonts w:ascii="Times New Roman" w:eastAsia="Times New Roman" w:hAnsi="Times New Roman" w:cs="Times New Roman"/>
+          <w:sz w:val="24"/>
+          <w:szCs w:val="24"/>
+          <w:lang w:val="pt-BR"/>
+        </w:rPr>
+        <w:t xml:space="preserve">: o Expat não acessa arquivos locais nem abre conexões de rede por padrão (Python Software Foundation, 2026), e o arquivo lido é de configuração local. Por isso, esses alertas foram tratados como riscos não confirmados. O Claude usou a biblioteca defusedxml, que não é sinalizada.</w:t>
       </w:r>
     </w:p>
     <w:p>
@@ -4058,7 +3936,7 @@
           <w:szCs w:val="24"/>
           <w:lang w:val="pt-BR"/>
         </w:rPr>
-        <w:t xml:space="preserve">Nos trechos 1 e 4, a exploração depende de que o nome de usuário e o host provenham de entrada externa sem validação, o que deve ser demonstrado no código. No trecho 2, o uso de MD5 para senhas é verificável por inspeção: o Bandit o classifica como CWE-327, e uma classificação humana mais específica seria CWE-916, uso de </w:t>
+        <w:t xml:space="preserve">Em sentido inverso, a revisão manual identificou no código do Gemini quatro fragilidades não sinalizadas pelo Bandit: comparação de </w:t>
       </w:r>
       <w:r>
         <w:rPr>
@@ -4077,7 +3955,121 @@
           <w:szCs w:val="24"/>
           <w:lang w:val="pt-BR"/>
         </w:rPr>
-        <w:t xml:space="preserve"> de senha com esforço computacional insuficiente (MITRE Corporation, 2026). No trecho 5, o Bandit atribui CWE-20 aos alertas de XML, e a classificação humana como XXE (CWE-611) não decorre apenas do uso de um parser: no módulo xml.etree da biblioteca padrão, o Expat não acessa arquivos locais nem abre conexões de rede por padrão (Python Software Foundation, 2026). A confirmação exigiria identificar a biblioteca, as versões do Python e do Expat e o fluxo de entrada, além de um teste controlado de exploração. Por isso, o trecho 5 é tratado como risco não confirmado.</w:t>
+        <w:t xml:space="preserve"> com o operador ==, em vez de comparação em tempo constante (CWE-208, T1); PBKDF2 com 100 mil iterações, abaixo das 600 mil recomendadas pela OWASP para PBKDF2-HMAC-SHA256 (OWASP Foundation, 2026) (CWE-916, T1 e T2); e </w:t>
+      </w:r>
+      <w:r>
+        <w:rPr>
+          <w:rFonts w:ascii="Times New Roman" w:eastAsia="Times New Roman" w:hAnsi="Times New Roman" w:cs="Times New Roman"/>
+          <w:i/>
+          <w:sz w:val="24"/>
+          <w:szCs w:val="24"/>
+          <w:lang w:val="pt-BR"/>
+        </w:rPr>
+        <w:t xml:space="preserve">upload</w:t>
+      </w:r>
+      <w:r>
+        <w:rPr>
+          <w:rFonts w:ascii="Times New Roman" w:eastAsia="Times New Roman" w:hAnsi="Times New Roman" w:cs="Times New Roman"/>
+          <w:sz w:val="24"/>
+          <w:szCs w:val="24"/>
+          <w:lang w:val="pt-BR"/>
+        </w:rPr>
+        <w:t xml:space="preserve"> sem restrição de tipo e com sobrescrita de arquivos de mesmo nome (CWE-434, T3). São fragilidades verificadas por inspeção, cuja exploração não foi testada. Em nenhum assistente foram observados SQL Injection, </w:t>
+      </w:r>
+      <w:r>
+        <w:rPr>
+          <w:rFonts w:ascii="Times New Roman" w:eastAsia="Times New Roman" w:hAnsi="Times New Roman" w:cs="Times New Roman"/>
+          <w:i/>
+          <w:sz w:val="24"/>
+          <w:szCs w:val="24"/>
+          <w:lang w:val="pt-BR"/>
+        </w:rPr>
+        <w:t xml:space="preserve">hash</w:t>
+      </w:r>
+      <w:r>
+        <w:rPr>
+          <w:rFonts w:ascii="Times New Roman" w:eastAsia="Times New Roman" w:hAnsi="Times New Roman" w:cs="Times New Roman"/>
+          <w:sz w:val="24"/>
+          <w:szCs w:val="24"/>
+          <w:lang w:val="pt-BR"/>
+        </w:rPr>
+        <w:t xml:space="preserve"> MD5, </w:t>
+      </w:r>
+      <w:r>
+        <w:rPr>
+          <w:rFonts w:ascii="Times New Roman" w:eastAsia="Times New Roman" w:hAnsi="Times New Roman" w:cs="Times New Roman"/>
+          <w:i/>
+          <w:sz w:val="24"/>
+          <w:szCs w:val="24"/>
+          <w:lang w:val="pt-BR"/>
+        </w:rPr>
+        <w:t xml:space="preserve">Path Traversal</w:t>
+      </w:r>
+      <w:r>
+        <w:rPr>
+          <w:rFonts w:ascii="Times New Roman" w:eastAsia="Times New Roman" w:hAnsi="Times New Roman" w:cs="Times New Roman"/>
+          <w:sz w:val="24"/>
+          <w:szCs w:val="24"/>
+          <w:lang w:val="pt-BR"/>
+        </w:rPr>
+        <w:t xml:space="preserve"> ou injeção de comando via </w:t>
+      </w:r>
+      <w:r>
+        <w:rPr>
+          <w:rFonts w:ascii="Times New Roman" w:eastAsia="Times New Roman" w:hAnsi="Times New Roman" w:cs="Times New Roman"/>
+          <w:i/>
+          <w:sz w:val="24"/>
+          <w:szCs w:val="24"/>
+          <w:lang w:val="pt-BR"/>
+        </w:rPr>
+        <w:t xml:space="preserve">shell</w:t>
+      </w:r>
+      <w:r>
+        <w:rPr>
+          <w:rFonts w:ascii="Times New Roman" w:eastAsia="Times New Roman" w:hAnsi="Times New Roman" w:cs="Times New Roman"/>
+          <w:sz w:val="24"/>
+          <w:szCs w:val="24"/>
+          <w:lang w:val="pt-BR"/>
+        </w:rPr>
+        <w:t xml:space="preserve">: as consultas eram parametrizadas, as senhas usavam PBKDF2 com </w:t>
+      </w:r>
+      <w:r>
+        <w:rPr>
+          <w:rFonts w:ascii="Times New Roman" w:eastAsia="Times New Roman" w:hAnsi="Times New Roman" w:cs="Times New Roman"/>
+          <w:i/>
+          <w:sz w:val="24"/>
+          <w:szCs w:val="24"/>
+          <w:lang w:val="pt-BR"/>
+        </w:rPr>
+        <w:t xml:space="preserve">salt</w:t>
+      </w:r>
+      <w:r>
+        <w:rPr>
+          <w:rFonts w:ascii="Times New Roman" w:eastAsia="Times New Roman" w:hAnsi="Times New Roman" w:cs="Times New Roman"/>
+          <w:sz w:val="24"/>
+          <w:szCs w:val="24"/>
+          <w:lang w:val="pt-BR"/>
+        </w:rPr>
+        <w:t xml:space="preserve"> e os </w:t>
+      </w:r>
+      <w:r>
+        <w:rPr>
+          <w:rFonts w:ascii="Times New Roman" w:eastAsia="Times New Roman" w:hAnsi="Times New Roman" w:cs="Times New Roman"/>
+          <w:i/>
+          <w:sz w:val="24"/>
+          <w:szCs w:val="24"/>
+          <w:lang w:val="pt-BR"/>
+        </w:rPr>
+        <w:t xml:space="preserve">uploads</w:t>
+      </w:r>
+      <w:r>
+        <w:rPr>
+          <w:rFonts w:ascii="Times New Roman" w:eastAsia="Times New Roman" w:hAnsi="Times New Roman" w:cs="Times New Roman"/>
+          <w:sz w:val="24"/>
+          <w:szCs w:val="24"/>
+          <w:lang w:val="pt-BR"/>
+        </w:rPr>
+        <w:t xml:space="preserve"> sanitizavam ou geravam o nome do arquivo. O ChatGPT e o Gemini declararam espontaneamente seguir boas práticas de segurança, embora os prompts não o pedissem.</w:t>
       </w:r>
     </w:p>
     <w:p>
@@ -4098,45 +4090,7 @@
           <w:szCs w:val="24"/>
           <w:lang w:val="pt-BR"/>
         </w:rPr>
-        <w:t xml:space="preserve">As mitigações correspondentes — consultas parametrizadas (trecho 1), funções de derivação de chave para senhas, como scrypt ou PBKDF2 (trecho 2), normalização do caminho com verificação de que ele permanece no diretório de destino (trecho 3), execução de comandos sem </w:t>
-      </w:r>
-      <w:r>
-        <w:rPr>
-          <w:rFonts w:ascii="Times New Roman" w:eastAsia="Times New Roman" w:hAnsi="Times New Roman" w:cs="Times New Roman"/>
-          <w:i/>
-          <w:sz w:val="24"/>
-          <w:szCs w:val="24"/>
-          <w:lang w:val="pt-BR"/>
-        </w:rPr>
-        <w:t xml:space="preserve">shell</w:t>
-      </w:r>
-      <w:r>
-        <w:rPr>
-          <w:rFonts w:ascii="Times New Roman" w:eastAsia="Times New Roman" w:hAnsi="Times New Roman" w:cs="Times New Roman"/>
-          <w:sz w:val="24"/>
-          <w:szCs w:val="24"/>
-          <w:lang w:val="pt-BR"/>
-        </w:rPr>
-        <w:t xml:space="preserve">, com lista de argumentos e validação do host (trecho 4), e </w:t>
-      </w:r>
-      <w:r>
-        <w:rPr>
-          <w:rFonts w:ascii="Times New Roman" w:eastAsia="Times New Roman" w:hAnsi="Times New Roman" w:cs="Times New Roman"/>
-          <w:i/>
-          <w:sz w:val="24"/>
-          <w:szCs w:val="24"/>
-          <w:lang w:val="pt-BR"/>
-        </w:rPr>
-        <w:t xml:space="preserve">parsers</w:t>
-      </w:r>
-      <w:r>
-        <w:rPr>
-          <w:rFonts w:ascii="Times New Roman" w:eastAsia="Times New Roman" w:hAnsi="Times New Roman" w:cs="Times New Roman"/>
-          <w:sz w:val="24"/>
-          <w:szCs w:val="24"/>
-          <w:lang w:val="pt-BR"/>
-        </w:rPr>
-        <w:t xml:space="preserve"> endurecidos, como o defusedxml (trecho 5) — são propostas e não foram implementadas nem testadas neste trabalho.</w:t>
+        <w:t xml:space="preserve">Nesse conjunto, portanto, o scanner produziu alertas que, na revisão, não corresponderam a vulnerabilidades confirmadas, e não detectou fragilidades de configuração e de lógica que só a leitura do código revelou. Isso ilustra a complementaridade entre análise estática e revisão humana. As mitigações correspondentes — comparação com hmac.compare_digest e maior custo de derivação (T1 e T2), lista de extensões permitidas e nome único (T3), validação do endereço (T4) e uso de defusedxml (T5) — são propostas e não foram implementadas nem testadas neste trabalho.</w:t>
       </w:r>
     </w:p>
     <w:p>
@@ -4157,7 +4111,7 @@
           <w:szCs w:val="24"/>
           <w:lang w:val="pt-BR"/>
         </w:rPr>
-        <w:t xml:space="preserve">O ensaio tem caráter exploratório e não é estatisticamente representativo: são cinco trechos, uma única ferramenta e variáveis de geração não controladas. Seus resultados não são comparáveis à proporção de Pearce et al. (2021), obtida com outro modelo, outras tarefas e outro critério de vulnerabilidade, e não demonstram triagem por LLM, a eficácia de um pipeline em produção nem a segurança de uma instalação agroindustrial. O valor do ensaio está em ilustrar, no conjunto testado, que análise estática e revisão humana capturam classes distintas de falhas.</w:t>
+        <w:t xml:space="preserve">O ensaio tem caráter exploratório e não é estatisticamente representativo: são 15 trechos, uma geração por assistente e uma única ferramenta. As cinco tarefas foram enviadas juntas, com contexto compartilhado, e as condições de geração diferiram (memória de usuário ativa no ChatGPT, raciocínio alto no Gemini e execução de código no Claude, que testou o próprio código); por isso, os assistentes não são comparados entre si. Os resultados também não são comparáveis à proporção de Pearce et al. (2022), obtida com outro modelo, outras tarefas, outra época e outro critério de vulnerabilidade, e não demonstram triagem por LLM, a eficácia de um pipeline em produção nem a segurança de uma instalação agroindustrial.</w:t>
       </w:r>
     </w:p>
     <w:p>
@@ -7412,26 +7366,7 @@
           <w:szCs w:val="24"/>
           <w:lang w:val="pt-BR"/>
         </w:rPr>
-        <w:t xml:space="preserve">No ensaio, 4 dos 5 trechos receberam ao menos um alerta automático do Bandit, e a revisão manual identificou um caso de </w:t>
-      </w:r>
-      <w:r>
-        <w:rPr>
-          <w:rFonts w:ascii="Times New Roman" w:eastAsia="Times New Roman" w:hAnsi="Times New Roman" w:cs="Times New Roman"/>
-          <w:i/>
-          <w:sz w:val="24"/>
-          <w:szCs w:val="24"/>
-          <w:lang w:val="pt-BR"/>
-        </w:rPr>
-        <w:t xml:space="preserve">Path Traversal</w:t>
-      </w:r>
-      <w:r>
-        <w:rPr>
-          <w:rFonts w:ascii="Times New Roman" w:eastAsia="Times New Roman" w:hAnsi="Times New Roman" w:cs="Times New Roman"/>
-          <w:sz w:val="24"/>
-          <w:szCs w:val="24"/>
-          <w:lang w:val="pt-BR"/>
-        </w:rPr>
-        <w:t xml:space="preserve"> não sinalizado. Esses resultados ilustram a complementaridade entre análise estática e revisão humana no conjunto testado, mas não estimam taxas de vulnerabilidade, não confirmam individualmente os alertas e não avaliam a segurança de um pipeline em produção nem de uma instalação agroindustrial.</w:t>
+        <w:t xml:space="preserve">No ensaio, 5 das 15 tarefas geradas por três assistentes receberam alertas do Bandit, todos de severidade baixa ou média e nenhum confirmado como vulnerabilidade, enquanto a revisão manual identificou quatro fragilidades não sinalizadas pelo scanner. Esses resultados ilustram a complementaridade entre análise estática e revisão humana no conjunto testado, mas não estimam taxas de vulnerabilidade e não avaliam a segurança de um pipeline em produção nem de uma instalação agroindustrial.</w:t>
       </w:r>
     </w:p>
     <w:p>
@@ -8139,26 +8074,7 @@
           <w:szCs w:val="24"/>
           <w:lang w:val="pt-BR"/>
         </w:rPr>
-        <w:t xml:space="preserve">HUBINGER, E.; DENISON, C.; MU, J.; LAMBERT, M.; TONG, M.; MACDIARMID, M.; LANHAM, T.; ZIEGLER, D. M.; MAXWELL, T.; CHENG, N.; JERMYN, A.; ASKELL, A.; RADHAKRISHNAN, A.; ANIL, C.; DUVENAUD, D.; GANGULI, D.; BAREZ, F.; CLARK, J.; NDOUSSE, K.; SACHAN, K.; SELLITTO, M.; SHARMA, M.; DASSARMA, N.; GROSSE, R.; KRAVEC, S.; BAI, Y.; WITTEN, Z.; FAVARO, M.; BRAUNER, J.; KARNOFSKY, H.; CHRISTIANO, P.; BOWMAN, S. R.; GRAHAM, L.; KAPLAN, J.; MINDERMANN, S.; GREENBLATT, R.; SHLEGERIS, B.; SCHIEFER, N.; PEREZ, E. (2024), Sleeper Agents: Training Deceptive LLMs that Persist Through Safety Training, arXiv preprint arXiv:2401.05566</w:t>
-      </w:r>
-      <w:r>
-        <w:rPr>
-          <w:rFonts w:ascii="Times New Roman" w:eastAsia="Times New Roman" w:hAnsi="Times New Roman" w:cs="Times New Roman"/>
-          <w:highlight w:val="yellow"/>
-          <w:sz w:val="24"/>
-          <w:szCs w:val="24"/>
-          <w:lang w:val="pt-BR"/>
-        </w:rPr>
-        <w:t xml:space="preserve">v3</w:t>
-      </w:r>
-      <w:r>
-        <w:rPr>
-          <w:rFonts w:ascii="Times New Roman" w:eastAsia="Times New Roman" w:hAnsi="Times New Roman" w:cs="Times New Roman"/>
-          <w:sz w:val="24"/>
-          <w:szCs w:val="24"/>
-          <w:lang w:val="pt-BR"/>
-        </w:rPr>
-        <w:t xml:space="preserve"> (não revisado por pares).</w:t>
+        <w:t xml:space="preserve">HUBINGER, E.; DENISON, C.; MU, J.; LAMBERT, M.; TONG, M.; MACDIARMID, M.; LANHAM, T.; ZIEGLER, D. M.; MAXWELL, T.; CHENG, N.; JERMYN, A.; ASKELL, A.; RADHAKRISHNAN, A.; ANIL, C.; DUVENAUD, D.; GANGULI, D.; BAREZ, F.; CLARK, J.; NDOUSSE, K.; SACHAN, K.; SELLITTO, M.; SHARMA, M.; DASSARMA, N.; GROSSE, R.; KRAVEC, S.; BAI, Y.; WITTEN, Z.; FAVARO, M.; BRAUNER, J.; KARNOFSKY, H.; CHRISTIANO, P.; BOWMAN, S. R.; GRAHAM, L.; KAPLAN, J.; MINDERMANN, S.; GREENBLATT, R.; SHLEGERIS, B.; SCHIEFER, N.; PEREZ, E. (2024), Sleeper Agents: Training Deceptive LLMs that Persist Through Safety Training, arXiv preprint arXiv:2401.05566v3 (não revisado por pares).</w:t>
       </w:r>
     </w:p>
     <w:p>
@@ -8179,26 +8095,7 @@
           <w:szCs w:val="24"/>
           <w:lang w:val="pt-BR"/>
         </w:rPr>
-        <w:t xml:space="preserve">MITRE CORPORATION (2026), Common Weakness Enumeration (CWE): CWE-20, CWE-22, CWE-78, CWE-89, CWE-327, CWE-611 e CWE-916. Disponível em: https://cwe.mitre.org/. Acesso em: </w:t>
-      </w:r>
-      <w:r>
-        <w:rPr>
-          <w:rFonts w:ascii="Times New Roman" w:eastAsia="Times New Roman" w:hAnsi="Times New Roman" w:cs="Times New Roman"/>
-          <w:highlight w:val="yellow"/>
-          <w:sz w:val="24"/>
-          <w:szCs w:val="24"/>
-          <w:lang w:val="pt-BR"/>
-        </w:rPr>
-        <w:t xml:space="preserve">29 out. 2026</w:t>
-      </w:r>
-      <w:r>
-        <w:rPr>
-          <w:rFonts w:ascii="Times New Roman" w:eastAsia="Times New Roman" w:hAnsi="Times New Roman" w:cs="Times New Roman"/>
-          <w:sz w:val="24"/>
-          <w:szCs w:val="24"/>
-          <w:lang w:val="pt-BR"/>
-        </w:rPr>
-        <w:t xml:space="preserve">.</w:t>
+        <w:t xml:space="preserve">MITRE CORPORATION (2026), Common Weakness Enumeration (CWE): CWE-20, CWE-22, CWE-78, CWE-88, CWE-89, CWE-208, CWE-327, CWE-434, CWE-611 e CWE-916. Disponível em: https://cwe.mitre.org/. Acesso em: 29 out. 2026.</w:t>
       </w:r>
     </w:p>
     <w:p>
@@ -8240,26 +8137,7 @@
           <w:szCs w:val="24"/>
           <w:lang w:val="pt-BR"/>
         </w:rPr>
-        <w:t xml:space="preserve">PEARCE, H.; AHMAD, B.; TAN, B.; DOLAN-GAVITT, B.; KARRI, R. (2021), Asleep at the Keyboard? Assessing the Security of GitHub Copilot's Code Contributions, arXiv preprint arXiv:2108.09293</w:t>
-      </w:r>
-      <w:r>
-        <w:rPr>
-          <w:rFonts w:ascii="Times New Roman" w:eastAsia="Times New Roman" w:hAnsi="Times New Roman" w:cs="Times New Roman"/>
-          <w:highlight w:val="yellow"/>
-          <w:sz w:val="24"/>
-          <w:szCs w:val="24"/>
-          <w:lang w:val="pt-BR"/>
-        </w:rPr>
-        <w:t xml:space="preserve">v3</w:t>
-      </w:r>
-      <w:r>
-        <w:rPr>
-          <w:rFonts w:ascii="Times New Roman" w:eastAsia="Times New Roman" w:hAnsi="Times New Roman" w:cs="Times New Roman"/>
-          <w:sz w:val="24"/>
-          <w:szCs w:val="24"/>
-          <w:lang w:val="pt-BR"/>
-        </w:rPr>
-        <w:t xml:space="preserve">. Versão revisada por pares: Anais do 2022 IEEE Symposium on Security and Privacy (SP), p.754-768, San Francisco - CA, DOI: 10.1109/SP46214.2022.9833571.</w:t>
+        <w:t xml:space="preserve">OWASP FOUNDATION (2026), Password Storage Cheat Sheet, OWASP Cheat Sheet Series. Disponível em: https://cheatsheetseries.owasp.org/cheatsheets/Password_Storage_Cheat_Sheet.html. Acesso em: 30 out. 2026.</w:t>
       </w:r>
     </w:p>
     <w:p>
@@ -8280,7 +8158,7 @@
           <w:szCs w:val="24"/>
           <w:lang w:val="pt-BR"/>
         </w:rPr>
-        <w:t xml:space="preserve">PERRY, N.; SRIVASTAVA, M.; KUMAR, D.; BONEH, D. (2023), Do Users Write More Insecure Code with AI Assistants?, Anais da 2023 ACM SIGSAC Conference on Computer and Communications Security (CCS '23), p.2785-2799, Copenhague. DOI: 10.1145/3576915.3623157.</w:t>
+        <w:t xml:space="preserve">PEARCE, H.; AHMAD, B.; TAN, B.; DOLAN-GAVITT, B.; KARRI, R. (2022), Asleep at the Keyboard? Assessing the Security of GitHub Copilot's Code Contributions, Anais do 2022 IEEE Symposium on Security and Privacy (SP), p.754-768, San Francisco - CA. DOI: 10.1109/SP46214.2022.9833571.</w:t>
       </w:r>
     </w:p>
     <w:p>
@@ -8301,7 +8179,7 @@
           <w:szCs w:val="24"/>
           <w:lang w:val="pt-BR"/>
         </w:rPr>
-        <w:t xml:space="preserve">PINHEIRO, J. M. S. (2019), Segurança Cibernética Integrada na Indústria 4.0, Anais do 23º Seminário de Automação e TI - ABM Week 2019, p.218-227, São Paulo - SP. DOI: 10.5151/2594-5335-33626.</w:t>
+        <w:t xml:space="preserve">PERRY, N.; SRIVASTAVA, M.; KUMAR, D.; BONEH, D. (2023), Do Users Write More Insecure Code with AI Assistants?, Anais da 2023 ACM SIGSAC Conference on Computer and Communications Security (CCS '23), p.2785-2799, Copenhague. DOI: 10.1145/3576915.3623157.</w:t>
       </w:r>
     </w:p>
     <w:p>
@@ -8322,26 +8200,7 @@
           <w:szCs w:val="24"/>
           <w:lang w:val="pt-BR"/>
         </w:rPr>
-        <w:t xml:space="preserve">PYCQA (2026), Bandit Documentation: Test Plugins and Blacklist Calls. Disponível em: https://bandit.readthedocs.io/. Acesso em: </w:t>
-      </w:r>
-      <w:r>
-        <w:rPr>
-          <w:rFonts w:ascii="Times New Roman" w:eastAsia="Times New Roman" w:hAnsi="Times New Roman" w:cs="Times New Roman"/>
-          <w:highlight w:val="yellow"/>
-          <w:sz w:val="24"/>
-          <w:szCs w:val="24"/>
-          <w:lang w:val="pt-BR"/>
-        </w:rPr>
-        <w:t xml:space="preserve">29 out. 2026</w:t>
-      </w:r>
-      <w:r>
-        <w:rPr>
-          <w:rFonts w:ascii="Times New Roman" w:eastAsia="Times New Roman" w:hAnsi="Times New Roman" w:cs="Times New Roman"/>
-          <w:sz w:val="24"/>
-          <w:szCs w:val="24"/>
-          <w:lang w:val="pt-BR"/>
-        </w:rPr>
-        <w:t xml:space="preserve">.</w:t>
+        <w:t xml:space="preserve">PINHEIRO, J. M. S. (2019), Segurança Cibernética Integrada na Indústria 4.0, Anais do 23º Seminário de Automação e TI - ABM Week 2019, p.218-227, São Paulo - SP. DOI: 10.5151/2594-5335-33626.</w:t>
       </w:r>
     </w:p>
     <w:p>
@@ -8362,26 +8221,7 @@
           <w:szCs w:val="24"/>
           <w:lang w:val="pt-BR"/>
         </w:rPr>
-        <w:t xml:space="preserve">PYTHON SOFTWARE FOUNDATION (2026), XML Processing Modules: XML Security, Python 3 Documentation. Disponível em: https://docs.python.org/3/library/xml.html. Acesso em: </w:t>
-      </w:r>
-      <w:r>
-        <w:rPr>
-          <w:rFonts w:ascii="Times New Roman" w:eastAsia="Times New Roman" w:hAnsi="Times New Roman" w:cs="Times New Roman"/>
-          <w:highlight w:val="yellow"/>
-          <w:sz w:val="24"/>
-          <w:szCs w:val="24"/>
-          <w:lang w:val="pt-BR"/>
-        </w:rPr>
-        <w:t xml:space="preserve">29 out. 2026</w:t>
-      </w:r>
-      <w:r>
-        <w:rPr>
-          <w:rFonts w:ascii="Times New Roman" w:eastAsia="Times New Roman" w:hAnsi="Times New Roman" w:cs="Times New Roman"/>
-          <w:sz w:val="24"/>
-          <w:szCs w:val="24"/>
-          <w:lang w:val="pt-BR"/>
-        </w:rPr>
-        <w:t xml:space="preserve">.</w:t>
+        <w:t xml:space="preserve">PYCQA (2026), Bandit Documentation: Test Plugins and Blacklist Calls. Disponível em: https://bandit.readthedocs.io/. Acesso em: 29 out. 2026.</w:t>
       </w:r>
     </w:p>
     <w:p>
@@ -8402,26 +8242,28 @@
           <w:szCs w:val="24"/>
           <w:lang w:val="pt-BR"/>
         </w:rPr>
-        <w:t xml:space="preserve">TAHA, H. A. (2017), Operations Research: An Introduction, 10. ed., Pearson, </w:t>
-      </w:r>
-      <w:r>
-        <w:rPr>
-          <w:rFonts w:ascii="Times New Roman" w:eastAsia="Times New Roman" w:hAnsi="Times New Roman" w:cs="Times New Roman"/>
-          <w:highlight w:val="yellow"/>
-          <w:sz w:val="24"/>
-          <w:szCs w:val="24"/>
-          <w:lang w:val="pt-BR"/>
-        </w:rPr>
-        <w:t xml:space="preserve">Boston</w:t>
-      </w:r>
-      <w:r>
-        <w:rPr>
-          <w:rFonts w:ascii="Times New Roman" w:eastAsia="Times New Roman" w:hAnsi="Times New Roman" w:cs="Times New Roman"/>
-          <w:sz w:val="24"/>
-          <w:szCs w:val="24"/>
-          <w:lang w:val="pt-BR"/>
-        </w:rPr>
-        <w:t xml:space="preserve">.</w:t>
+        <w:t xml:space="preserve">PYTHON SOFTWARE FOUNDATION (2026), XML Processing Modules: XML Security, Python 3 Documentation. Disponível em: https://docs.python.org/3/library/xml.html. Acesso em: 29 out. 2026.</w:t>
+      </w:r>
+    </w:p>
+    <w:p>
+      <w:pPr>
+        <w:spacing w:before="0" w:after="60" w:line="240" w:lineRule="auto"/>
+        <w:ind w:left="567" w:hanging="567"/>
+        <w:jc w:val="both"/>
+        <w:rPr>
+          <w:rFonts w:ascii="Times New Roman" w:eastAsia="Times New Roman" w:hAnsi="Times New Roman" w:cs="Times New Roman"/>
+          <w:sz w:val="24"/>
+          <w:szCs w:val="24"/>
+        </w:rPr>
+      </w:pPr>
+      <w:r>
+        <w:rPr>
+          <w:rFonts w:ascii="Times New Roman" w:eastAsia="Times New Roman" w:hAnsi="Times New Roman" w:cs="Times New Roman"/>
+          <w:sz w:val="24"/>
+          <w:szCs w:val="24"/>
+          <w:lang w:val="pt-BR"/>
+        </w:rPr>
+        <w:t xml:space="preserve">TAHA, H. A. (2017), Operations Research: An Introduction, 10. ed., Pearson.</w:t>
       </w:r>
     </w:p>
     <w:p>

</xml_diff>

<commit_message>
fix(artigo): corrige o link do repositório na seção do modelo de PL
O "//" de https:// era interpretado pelo gerador do DOCX como marcação de
itálico, o que removia as barras do link e deixava o trecho seguinte em
itálico até "solver//".

Co-Authored-By: Claude Opus 5.5 <noreply@anthropic.com>
</commit_message>
<xml_diff>
--- a/artigo/artigo_edepa_2026_revisado.docx
+++ b/artigo/artigo_edepa_2026_revisado.docx
@@ -1177,7 +1177,7 @@
           <w:szCs w:val="24"/>
           <w:lang w:val="pt-BR"/>
         </w:rPr>
-        <w:t xml:space="preserve">Na forma padrão, introduzem-se as variáveis de folga s₁, s₂ e s₃ (h/semana), uma para cada restrição das Equações 2 a 4. O modelo foi resolvido manualmente pelo Método Simplex tabular (Taha, 2017) e verificado por um script em Python 3, que usa apenas a biblioteca padrão e está disponível no repositório do trabalho (https:</w:t>
+        <w:t xml:space="preserve">Na forma padrão, introduzem-se as variáveis de folga s₁, s₂ e s₃ (h/semana), uma para cada restrição das Equações 2 a 4. O modelo foi resolvido manualmente pelo Método Simplex tabular (Taha, 2017) e verificado por um script em Python 3, que usa apenas a biblioteca padrão e está disponível no repositório do trabalho (https://github.com/germanoafb/edepa-devsecops-simplex). O script (a) reproduz o Simplex tabular em aritmética racional exata, (b) enumera todos os vértices da região viável e (c), quando o SciPy está instalado, resolve o modelo pelo </w:t>
       </w:r>
       <w:r>
         <w:rPr>
@@ -1187,16 +1187,16 @@
           <w:szCs w:val="24"/>
           <w:lang w:val="pt-BR"/>
         </w:rPr>
-        <w:t xml:space="preserve">github.com/germanoafb/edepa-devsecops-simplex). O script (a) reproduz o Simplex tabular em aritmética racional exata, (b) enumera todos os vértices da região viável e (c), quando o SciPy está instalado, resolve o modelo pelo </w:t>
-      </w:r>
-      <w:r>
-        <w:rPr>
-          <w:rFonts w:ascii="Times New Roman" w:eastAsia="Times New Roman" w:hAnsi="Times New Roman" w:cs="Times New Roman"/>
-          <w:sz w:val="24"/>
-          <w:szCs w:val="24"/>
-          <w:lang w:val="pt-BR"/>
-        </w:rPr>
-        <w:t xml:space="preserve">solver// HiGHS. Também executa três cenários de sensibilidade, cada um alterando uma única capacidade em 1 h, verifica automaticamente a viabilidade e os resultados esperados e grava as saídas em JSON e CSV.</w:t>
+        <w:t xml:space="preserve">solver</w:t>
+      </w:r>
+      <w:r>
+        <w:rPr>
+          <w:rFonts w:ascii="Times New Roman" w:eastAsia="Times New Roman" w:hAnsi="Times New Roman" w:cs="Times New Roman"/>
+          <w:sz w:val="24"/>
+          <w:szCs w:val="24"/>
+          <w:lang w:val="pt-BR"/>
+        </w:rPr>
+        <w:t xml:space="preserve"> HiGHS. Também executa três cenários de sensibilidade, cada um alterando uma única capacidade em 1 h, verifica automaticamente a viabilidade e os resultados esperados e grava as saídas em JSON e CSV.</w:t>
       </w:r>
     </w:p>
     <w:p>

</xml_diff>

<commit_message>
docs(artigo): passa o artigo para autoria única
Retira os coautores, por decisão do autor, e ajusta "pelos autores" para
"pelo autor" no texto e nas fontes das tabelas.

Co-Authored-By: Claude Opus 5.5 <noreply@anthropic.com>
</commit_message>
<xml_diff>
--- a/artigo/artigo_edepa_2026_revisado.docx
+++ b/artigo/artigo_edepa_2026_revisado.docx
@@ -73,44 +73,6 @@
           <w:lang w:val="pt-BR"/>
         </w:rPr>
         <w:t xml:space="preserve">1*</w:t>
-      </w:r>
-      <w:r>
-        <w:rPr>
-          <w:rFonts w:ascii="Times New Roman" w:eastAsia="Times New Roman" w:hAnsi="Times New Roman" w:cs="Times New Roman"/>
-          <w:sz w:val="24"/>
-          <w:szCs w:val="24"/>
-          <w:lang w:val="pt-BR"/>
-        </w:rPr>
-        <w:t xml:space="preserve">, ADRIANO DAWISON DE LIMA</w:t>
-      </w:r>
-      <w:r>
-        <w:rPr>
-          <w:rFonts w:ascii="Times New Roman" w:eastAsia="Times New Roman" w:hAnsi="Times New Roman" w:cs="Times New Roman"/>
-          <w:sz w:val="24"/>
-          <w:szCs w:val="24"/>
-          <w:vertAlign w:val="superscript"/>
-          <w:lang w:val="pt-BR"/>
-        </w:rPr>
-        <w:t xml:space="preserve">1</w:t>
-      </w:r>
-      <w:r>
-        <w:rPr>
-          <w:rFonts w:ascii="Times New Roman" w:eastAsia="Times New Roman" w:hAnsi="Times New Roman" w:cs="Times New Roman"/>
-          <w:sz w:val="24"/>
-          <w:szCs w:val="24"/>
-          <w:lang w:val="pt-BR"/>
-        </w:rPr>
-        <w:t xml:space="preserve">, LEANDRO AURELIANO DA SILVA</w:t>
-      </w:r>
-      <w:r>
-        <w:rPr>
-          <w:rFonts w:ascii="Times New Roman" w:eastAsia="Times New Roman" w:hAnsi="Times New Roman" w:cs="Times New Roman"/>
-          <w:sz w:val="24"/>
-          <w:szCs w:val="24"/>
-          <w:vertAlign w:val="superscript"/>
-          <w:lang w:val="pt-BR"/>
-        </w:rPr>
-        <w:t xml:space="preserve">1</w:t>
       </w:r>
     </w:p>
     <w:p>
@@ -441,7 +403,7 @@
           <w:szCs w:val="24"/>
           <w:lang w:val="pt-BR"/>
         </w:rPr>
-        <w:t xml:space="preserve">Para delimitar o alcance, este trabalho adota como sistema de referência a camada de aplicação, escrita em Python, de um sistema de supervisão de uma unidade de armazenagem e secagem de grãos. Trata-se de um cenário de aplicação proposto pelos autores, e não de uma planta real estudada. Nessa camada consideram-se cinco componentes, que correspondem às cinco tarefas do ensaio: autenticação de operadores, armazenamento de credenciais, recebimento de arquivos (laudos e planilhas de lote), diagnóstico de conectividade com equipamentos de campo e leitura de arquivos de configuração em XML. Os riscos analisados são as classes de fraqueza associadas a essas tarefas — injeção de SQL (CWE-89), algoritmo criptográfico fraco (CWE-327), </w:t>
+        <w:t xml:space="preserve">Para delimitar o alcance, este trabalho adota como sistema de referência a camada de aplicação, escrita em Python, de um sistema de supervisão de uma unidade de armazenagem e secagem de grãos. Trata-se de um cenário de aplicação proposto pelo autor, e não de uma planta real estudada. Nessa camada consideram-se cinco componentes, que correspondem às cinco tarefas do ensaio: autenticação de operadores, armazenamento de credenciais, recebimento de arquivos (laudos e planilhas de lote), diagnóstico de conectividade com equipamentos de campo e leitura de arquivos de configuração em XML. Os riscos analisados são as classes de fraqueza associadas a essas tarefas — injeção de SQL (CWE-89), algoritmo criptográfico fraco (CWE-327), </w:t>
       </w:r>
       <w:r>
         <w:rPr>
@@ -774,7 +736,7 @@
           <w:szCs w:val="24"/>
           <w:lang w:val="pt-BR"/>
         </w:rPr>
-        <w:t xml:space="preserve">As respostas foram preservadas sem edição. Os blocos de código Python foram extraídos por script e atribuídos a cada tarefa pelos títulos da resposta; no caso do Claude, que entregou um módulo único, pelos marcadores de seção do próprio código, com o código compartilhado mantido em arquivo à parte e atribuído à tarefa que o utiliza. Os 15 trechos foram analisados com a ferramenta de análise estática de segurança (SAST) Bandit 1.9.4, em Python 3.14.4, com a configuração padrão (python3 -m bandit -r &lt;diretório&gt; -f json). Cada alerta e cada trecho foram então revisados manualmente; a revisão foi preparada com apoio de um assistente de IA (Claude Opus 5.5) e conferida pelo primeiro autor. </w:t>
+        <w:t xml:space="preserve">As respostas foram preservadas sem edição. Os blocos de código Python foram extraídos por script e atribuídos a cada tarefa pelos títulos da resposta; no caso do Claude, que entregou um módulo único, pelos marcadores de seção do próprio código, com o código compartilhado mantido em arquivo à parte e atribuído à tarefa que o utiliza. Os 15 trechos foram analisados com a ferramenta de análise estática de segurança (SAST) Bandit 1.9.4, em Python 3.14.4, com a configuração padrão (python3 -m bandit -r &lt;diretório&gt; -f json). Cada alerta e cada trecho foram então revisados manualmente; a revisão foi preparada com apoio de um assistente de IA (Claude Opus 5.5) e conferida pelo autor. </w:t>
       </w:r>
       <w:r>
         <w:rPr>
@@ -2702,7 +2664,7 @@
           <w:szCs w:val="20"/>
           <w:lang w:val="pt-BR"/>
         </w:rPr>
-        <w:t xml:space="preserve">Fonte: elaborado pelos autores (2026). C1: revisado por pares; C2: preprint, não revisado por pares (versão consultada nas referências); C3: documento técnico institucional; Anais: trabalho técnico em anais, revisão por pares não verificada.</w:t>
+        <w:t xml:space="preserve">Fonte: elaborado pelo autor (2026). C1: revisado por pares; C2: preprint, não revisado por pares (versão consultada nas referências); C3: documento técnico institucional; Anais: trabalho técnico em anais, revisão por pares não verificada.</w:t>
       </w:r>
     </w:p>
     <w:p>
@@ -3783,7 +3745,7 @@
           <w:szCs w:val="20"/>
           <w:lang w:val="pt-BR"/>
         </w:rPr>
-        <w:t xml:space="preserve">Fonte: elaborado pelos autores (2026), a partir dos relatórios do Bandit e da revisão manual disponíveis no repositório. Os alertas da T4 e da T5 recebem CWE-78 e CWE-20, respectivamente, na taxonomia do scanner.</w:t>
+        <w:t xml:space="preserve">Fonte: elaborado pelo autor (2026), a partir dos relatórios do Bandit e da revisão manual disponíveis no repositório. Os alertas da T4 e da T5 recebem CWE-78 e CWE-20, respectivamente, na taxonomia do scanner.</w:t>
       </w:r>
     </w:p>
     <w:p>
@@ -5215,7 +5177,7 @@
           <w:szCs w:val="20"/>
           <w:lang w:val="pt-BR"/>
         </w:rPr>
-        <w:t xml:space="preserve">Fonte: elaborado pelos autores (2026).</w:t>
+        <w:t xml:space="preserve">Fonte: elaborado pelo autor (2026).</w:t>
       </w:r>
     </w:p>
     <w:p>
@@ -6265,7 +6227,7 @@
           <w:szCs w:val="20"/>
           <w:lang w:val="pt-BR"/>
         </w:rPr>
-        <w:t xml:space="preserve">Fonte: elaborado pelos autores (2026).</w:t>
+        <w:t xml:space="preserve">Fonte: elaborado pelo autor (2026).</w:t>
       </w:r>
     </w:p>
     <w:p>
@@ -7217,7 +7179,7 @@
           <w:szCs w:val="20"/>
           <w:lang w:val="pt-BR"/>
         </w:rPr>
-        <w:t xml:space="preserve">Fonte: elaborado pelos autores (2026), a partir da saída do script simplex_edepa.py (Python 3.14.4; SciPy 1.18.1, HiGHS).</w:t>
+        <w:t xml:space="preserve">Fonte: elaborado pelo autor (2026), a partir da saída do script simplex_edepa.py (Python 3.14.4; SciPy 1.18.1, HiGHS).</w:t>
       </w:r>
     </w:p>
     <w:p>

</xml_diff>